<commit_message>
Cahier de test AxisPro relu sur les écrans fusionnés (36 scénarios)
Second compte test.associe pour les décisions à deux (compartiment, passage forcé, décision scellée
avec sa confirmation, nouvelle révision) ; nouveaux scénarios : ouvrir puis retirer l'accès d'un
porteur, changer de responsable, suspendre, reprendre et clore un dossier ; reprise d'une pièce par
sa fenêtre, motif exigé dès le brouillon, cases du modèle financier lues à la française ; renvois
du cahier du portail renumérotés.

Co-Authored-By: Claude Opus 5.5 <noreply@anthropic.com>
</commit_message>
<xml_diff>
--- a/docs/projet/tests-utilisateurs/word/Cahier_de_test_05_AxisPro_Suite.docx
+++ b/docs/projet/tests-utilisateurs/word/Cahier_de_test_05_AxisPro_Suite.docx
@@ -88,7 +88,7 @@
           <w:sz w:val="20"/>
           <w:szCs w:val="20"/>
         </w:rPr>
-        <w:t xml:space="preserve">Dossiers, évaluation par critère et par gate, compartiments, comité et décision scellée, data room, plan d'actions, financements, modèle financier, temps et honoraires, outils du portail des porteurs.</w:t>
+        <w:t xml:space="preserve">Dossiers, évaluation par critère et par gate, compartiments, comité et décision scellée à deux, data room, plan d'actions, financements, modèle financier, temps et honoraires, équipe et accès des porteurs, outils du portail des porteurs.</w:t>
       </w:r>
     </w:p>
     <w:tbl>
@@ -816,7 +816,7 @@
           <w:sz w:val="20"/>
           <w:szCs w:val="20"/>
         </w:rPr>
-        <w:t xml:space="preserve">Deux consultants. Plusieurs scénarios demandent deux comptes du cabinet (un consultant et un associé) : une décision du comité engage toujours au moins deux personnes. Demandez à E-VOLUTION XP le second compte du cabinet avant de commencer.</w:t>
+        <w:t xml:space="preserve">Deux consultants. Une décision du comité, un passage de gate forcé et la réouverture d'un dossier décidé engagent toujours au moins deux personnes : ces scénarios se jouent avec test.consultant et test.associe, deux testeurs ou deux navigateurs.</w:t>
       </w:r>
     </w:p>
     <w:p>
@@ -845,7 +845,7 @@
           <w:sz w:val="20"/>
           <w:szCs w:val="20"/>
         </w:rPr>
-        <w:t xml:space="preserve">Jouer un scénario. Suivez les étapes dans l'ordre, avec les données indiquées. Un scénario à deux comptes se joue dans deux navigateurs (Chrome et Edge) ou sur deux postes. Travaillez de préférence sur un dossier ouvert pour le test (AXP-02), pas sur les dossiers de démonstration.</w:t>
+        <w:t xml:space="preserve">Jouer un scénario. Suivez les étapes dans l'ordre, avec les données indiquées. Un scénario à deux comptes se joue dans deux navigateurs (Chrome et Edge) ou sur deux postes. Travaillez sur le dossier ouvert pour le test (AXP-02), pas sur les dossiers de démonstration, sauf mention contraire.</w:t>
       </w:r>
     </w:p>
     <w:p>
@@ -903,7 +903,7 @@
           <w:sz w:val="20"/>
           <w:szCs w:val="20"/>
         </w:rPr>
-        <w:t xml:space="preserve">Signaler une anomalie. Menu du compte (rond à vos initiales, en haut à droite) &gt; « Mes demandes » &gt; « Nouvelle demande », type « Remarque de recette », application NIMOVA · MB AxisPro Consulting, la gravité ; titre commençant par le numéro du scénario (par exemple « AXP-13 : décision non scellée ») ; description ; « Déposer la demande ». Reportez le numéro reçu (DEM-…) dans les remarques.</w:t>
+        <w:t xml:space="preserve">Signaler une anomalie. Menu du compte (rond à vos initiales, en haut à droite) &gt; « Mes demandes » &gt; « Nouvelle demande », type « Remarque de recette », application NIMOVA · MB AxisPro Consulting, la gravité ; titre commençant par le numéro du scénario (par exemple « AXP-20 : décision non scellée ») ; description ; « Déposer la demande ». Reportez le numéro reçu (DEM-…) dans les remarques.</w:t>
       </w:r>
     </w:p>
     <w:p>
@@ -1244,7 +1244,7 @@
                 <w:sz w:val="17"/>
                 <w:szCs w:val="17"/>
               </w:rPr>
-              <w:t xml:space="preserve">second compte du cabinet</w:t>
+              <w:t xml:space="preserve">test.associe</w:t>
             </w:r>
           </w:p>
         </w:tc>
@@ -1722,7 +1722,7 @@
                 <w:sz w:val="17"/>
                 <w:szCs w:val="17"/>
               </w:rPr>
-              <w:t xml:space="preserve">refus</w:t>
+              <w:t xml:space="preserve">refus, facture d'honoraires</w:t>
             </w:r>
           </w:p>
         </w:tc>
@@ -2166,7 +2166,7 @@
           <w:sz w:val="20"/>
           <w:szCs w:val="20"/>
         </w:rPr>
-        <w:t xml:space="preserve">Objectif : vérifier l'ouverture d'un dossier et sa référence.</w:t>
+        <w:t xml:space="preserve">Objectif : vérifier l'ouverture d'un dossier, sa référence et son responsable.</w:t>
       </w:r>
     </w:p>
     <w:p>
@@ -2286,6 +2286,35 @@
     </w:p>
     <w:p>
       <w:pPr>
+        <w:tabs>
+          <w:tab w:val="left" w:pos="360"/>
+        </w:tabs>
+        <w:spacing w:after="60"/>
+        <w:ind w:left="360" w:hanging="360"/>
+        <w:jc w:val="both"/>
+      </w:pPr>
+      <w:r>
+        <w:rPr>
+          <w:rFonts w:ascii="Calibri" w:cs="Calibri" w:eastAsia="Calibri" w:hAnsi="Calibri"/>
+          <w:b/>
+          <w:bCs/>
+          <w:color w:val="1A9E9E"/>
+          <w:sz w:val="20"/>
+          <w:szCs w:val="20"/>
+        </w:rPr>
+        <w:t xml:space="preserve">4.	</w:t>
+      </w:r>
+      <w:r>
+        <w:rPr>
+          <w:rFonts w:ascii="Calibri" w:cs="Calibri" w:eastAsia="Calibri" w:hAnsi="Calibri"/>
+          <w:sz w:val="20"/>
+          <w:szCs w:val="20"/>
+        </w:rPr>
+        <w:t xml:space="preserve">Dans l'onglet « Synthèse », lisez le cadre « Équipe et accès du porteur au portail ».</w:t>
+      </w:r>
+    </w:p>
+    <w:p>
+      <w:pPr>
         <w:spacing w:after="100"/>
         <w:jc w:val="both"/>
       </w:pPr>
@@ -2295,7 +2324,7 @@
           <w:sz w:val="20"/>
           <w:szCs w:val="20"/>
         </w:rPr>
-        <w:t xml:space="preserve">Résultat attendu : le dossier reçoit une référence AX/… et s'ouvre sur l'onglet « Synthèse ». Les onglets sont « Synthèse », « Évaluation », « Stage gates », « Modèle financier », « Risques », « Actions », « Financements », « Data room », « Comités », « Journal », « Échanges », « Rapport » et « Temps ». test.consultant en est le responsable.</w:t>
+        <w:t xml:space="preserve">Résultat attendu : le dossier reçoit une référence AX/… et s'ouvre sur l'onglet « Synthèse ». Les onglets sont « Synthèse », « Évaluation », « Stage gates », « Modèle financier », « Risques », « Actions », « Financements », « Data room », « Comités », « Journal », « Échanges », « Rapport » et « Temps ». Le cadre indique « Responsable du dossier : Test - Consultant du cabinet » et « Aucun accès ouvert. ».</w:t>
       </w:r>
     </w:p>
     <w:tbl>
@@ -2652,7 +2681,7 @@
           <w:sz w:val="20"/>
           <w:szCs w:val="20"/>
         </w:rPr>
-        <w:t xml:space="preserve">Ouvrez « Détails, preuves et suivi » d'un critère : remplissez « Étude, analyse ou document à produire », « Responsable », « Échéance » et « Observation ».</w:t>
+        <w:t xml:space="preserve">Ouvrez « Détails, preuves et suivi » d'un critère : remplissez l'étude ou le document à produire, le responsable, l'échéance et l'observation.</w:t>
       </w:r>
     </w:p>
     <w:p>
@@ -2695,7 +2724,7 @@
           <w:sz w:val="20"/>
           <w:szCs w:val="20"/>
         </w:rPr>
-        <w:t xml:space="preserve">Résultat attendu : chaque statut s'enregistre aussitôt, avec « Dernière évaluation : test.consultant, le … ». Les scores Project Readiness, APD et Bankability de l'en-tête sont recalculés ; le nombre de critères évalués augmente.</w:t>
+        <w:t xml:space="preserve">Résultat attendu : chaque statut s'enregistre aussitôt, avec « Dernière évaluation : Test - Consultant du cabinet, le … ». Les scores de l'en-tête (Readiness, APD, Bankability) sont recalculés ; le nombre de critères évalués augmente.</w:t>
       </w:r>
     </w:p>
     <w:tbl>
@@ -3023,7 +3052,7 @@
           <w:sz w:val="20"/>
           <w:szCs w:val="20"/>
         </w:rPr>
-        <w:t xml:space="preserve">Déclarez un knock-out « Disponible » sans pièce. Lisez la ligne « Retenu ».</w:t>
+        <w:t xml:space="preserve">Déclarez un knock-out « Disponible » sans pièce. Lisez l'encadré sous la ligne.</w:t>
       </w:r>
     </w:p>
     <w:p>
@@ -3095,7 +3124,7 @@
           <w:sz w:val="20"/>
           <w:szCs w:val="20"/>
         </w:rPr>
-        <w:t xml:space="preserve">Résultat attendu : à l'étape 2, le critère est retenu « Incomplet » par la politique, la saisie restant « Disponible ». À l'étape 3, « Preuve « … » rattachée à … » ; le critère est retenu disponible. La pièce rattachée apparaît disponible dans la data room.</w:t>
+        <w:t xml:space="preserve">Résultat attendu : à l'étape 2, l'encadré indique « Retenu incomplet / à actualiser par la politique : … », la saisie restant « Disponible ». À l'étape 3, « Preuve « … » rattachée à … » ; le critère est retenu disponible et porte « 1 preuve ». La pièce rattachée apparaît disponible dans la data room.</w:t>
       </w:r>
     </w:p>
     <w:tbl>
@@ -3481,7 +3510,7 @@
           <w:sz w:val="20"/>
           <w:szCs w:val="20"/>
         </w:rPr>
-        <w:t xml:space="preserve">Lisez l'aperçu « Import de … » (colonnes « Critère », « Avant », « Après »), puis « Appliquer 2 modifications ».</w:t>
+        <w:t xml:space="preserve">Lisez l'aperçu des changements (colonnes « Critère », « Avant », « Après »), puis « Appliquer 2 modifications ».</w:t>
       </w:r>
     </w:p>
     <w:p>
@@ -3495,7 +3524,7 @@
           <w:sz w:val="20"/>
           <w:szCs w:val="20"/>
         </w:rPr>
-        <w:t xml:space="preserve">Résultat attendu : l'aperçu ne liste que les deux critères modifiés. Après application, « Fiche d'évaluation importée. » et les deux statuts sont à jour. Une fiche identique à l'évaluation affiche « Aucune modification : la fiche correspond déjà à l'évaluation du dossier. ».</w:t>
+        <w:t xml:space="preserve">Résultat attendu : l'aperçu ne liste que les deux critères modifiés. Après application, « Fiche d'évaluation importée : 2 critères mis à jour. ». Une fiche identique à l'évaluation affiche « Aucune modification : la fiche correspond déjà à l'évaluation du dossier. ».</w:t>
       </w:r>
     </w:p>
     <w:tbl>
@@ -3723,7 +3752,7 @@
           <w:sz w:val="22"/>
           <w:szCs w:val="22"/>
         </w:rPr>
-        <w:t xml:space="preserve">AXP-06. Lire les stage gates et passer au gate suivant</w:t>
+        <w:t xml:space="preserve">AXP-06. Lire les stage gates</w:t>
       </w:r>
     </w:p>
     <w:p>
@@ -3737,7 +3766,7 @@
           <w:sz w:val="20"/>
           <w:szCs w:val="20"/>
         </w:rPr>
-        <w:t xml:space="preserve">Objectif : vérifier la décision de chaque gate et le passage au gate suivant.</w:t>
+        <w:t xml:space="preserve">Objectif : vérifier la décision de chaque gate et le passage au gate suivant selon sa règle.</w:t>
       </w:r>
     </w:p>
     <w:p>
@@ -3823,7 +3852,36 @@
           <w:sz w:val="20"/>
           <w:szCs w:val="20"/>
         </w:rPr>
-        <w:t xml:space="preserve">Si la décision du gate le permet, cliquez sur « Passer au gate suivant ».</w:t>
+        <w:t xml:space="preserve">Cliquez sur « Passer au gate suivant ».</w:t>
+      </w:r>
+    </w:p>
+    <w:p>
+      <w:pPr>
+        <w:tabs>
+          <w:tab w:val="left" w:pos="360"/>
+        </w:tabs>
+        <w:spacing w:after="60"/>
+        <w:ind w:left="360" w:hanging="360"/>
+        <w:jc w:val="both"/>
+      </w:pPr>
+      <w:r>
+        <w:rPr>
+          <w:rFonts w:ascii="Calibri" w:cs="Calibri" w:eastAsia="Calibri" w:hAnsi="Calibri"/>
+          <w:b/>
+          <w:bCs/>
+          <w:color w:val="1A9E9E"/>
+          <w:sz w:val="20"/>
+          <w:szCs w:val="20"/>
+        </w:rPr>
+        <w:t xml:space="preserve">3.	</w:t>
+      </w:r>
+      <w:r>
+        <w:rPr>
+          <w:rFonts w:ascii="Calibri" w:cs="Calibri" w:eastAsia="Calibri" w:hAnsi="Calibri"/>
+          <w:sz w:val="20"/>
+          <w:szCs w:val="20"/>
+        </w:rPr>
+        <w:t xml:space="preserve">Si la fenêtre « Passage contre la règle du gate » s'ouvre, lisez les motifs, puis « Annuler ».</w:t>
       </w:r>
     </w:p>
     <w:p>
@@ -3837,7 +3895,7 @@
           <w:sz w:val="20"/>
           <w:szCs w:val="20"/>
         </w:rPr>
-        <w:t xml:space="preserve">Résultat attendu : chaque gate affiche GO, CONDITIONAL GO, HOLD ou NO-GO et ses motifs. Sous la complétude minimale, le gate reste en HOLD. Un passage permis fait du gate suivant le gate en cours ; le journal le garde.</w:t>
+        <w:t xml:space="preserve">Résultat attendu : chaque gate affiche GO, CONDITIONAL GO, HOLD ou NO-GO et ses motifs ; sous la complétude minimale, le gate reste en HOLD. Un passage permis affiche « Le dossier passe au gate suivant. ». Un passage contraire à la règle ouvre la fenêtre, qui demande un motif pour forcer (AXP-19) ; « Annuler » ne change rien.</w:t>
       </w:r>
     </w:p>
     <w:tbl>
@@ -4107,7 +4165,7 @@
           <w:sz w:val="20"/>
           <w:szCs w:val="20"/>
         </w:rPr>
-        <w:t xml:space="preserve">Données : le dossier « Usine de briques compressées (démo) » ou un dossier de test avec un modèle ; prix unitaire augmenté de 10 %.</w:t>
+        <w:t xml:space="preserve">Données : le dossier « Usine de briques compressées (démo) » ; prix unitaire augmenté de 10 %.</w:t>
       </w:r>
     </w:p>
     <w:p>
@@ -4165,7 +4223,7 @@
           <w:sz w:val="20"/>
           <w:szCs w:val="20"/>
         </w:rPr>
-        <w:t xml:space="preserve">Dans le tableau des produits, modifiez « Prix unitaire », puis cliquez ailleurs.</w:t>
+        <w:t xml:space="preserve">Dans le tableau des produits, modifiez « Prix unitaire », puis cliquez ailleurs (ou Entrée).</w:t>
       </w:r>
     </w:p>
     <w:p>
@@ -4208,7 +4266,7 @@
           <w:sz w:val="20"/>
           <w:szCs w:val="20"/>
         </w:rPr>
-        <w:t xml:space="preserve">Résultat attendu : la VAN, le TRI et le DSCR changent dès la sortie de la case. Le classeur exporté reprend les hypothèses et les comptes prévisionnels.</w:t>
+        <w:t xml:space="preserve">Résultat attendu : la VAN, le TRI et le DSCR changent dès la sortie de la case. Échap reprend la valeur enregistrée. Le classeur exporté reprend les hypothèses et les comptes prévisionnels.</w:t>
       </w:r>
     </w:p>
     <w:tbl>
@@ -4478,7 +4536,7 @@
           <w:sz w:val="20"/>
           <w:szCs w:val="20"/>
         </w:rPr>
-        <w:t xml:space="preserve">Données : risque « Retard de livraison des presses (essai) », probabilité et impact élevés.</w:t>
+        <w:t xml:space="preserve">Données : risque « Retard de livraison des presses (essai) » ; probabilité et impact élevés ; traitement confié au porteur.</w:t>
       </w:r>
     </w:p>
     <w:p>
@@ -4507,7 +4565,7 @@
           <w:sz w:val="20"/>
           <w:szCs w:val="20"/>
         </w:rPr>
-        <w:t xml:space="preserve">Onglet « Risques », « Nouveau risque ». Remplissez le risque, la probabilité, l'impact, la mesure d'atténuation et les valeurs après traitement. Enregistrez.</w:t>
+        <w:t xml:space="preserve">Onglet « Risques », cadre « Nouveau risque » : remplissez « Risque », « Catégorie », « Responsable du traitement », « Probabilité », « Impact » et « Mesures d'atténuation », puis « Enregistrer ».</w:t>
       </w:r>
     </w:p>
     <w:p>
@@ -4565,7 +4623,36 @@
           <w:sz w:val="20"/>
           <w:szCs w:val="20"/>
         </w:rPr>
-        <w:t xml:space="preserve">Cliquez sur « Créer l'action de traitement », puis ouvrez l'onglet « Actions ».</w:t>
+        <w:t xml:space="preserve">Ouvrez le risque, renseignez « Probabilité après traitement » et « Impact après traitement », puis cliquez sur « Créer l'action de traitement ». Lisez la fenêtre, puis « Créer l'action ».</w:t>
+      </w:r>
+    </w:p>
+    <w:p>
+      <w:pPr>
+        <w:tabs>
+          <w:tab w:val="left" w:pos="360"/>
+        </w:tabs>
+        <w:spacing w:after="60"/>
+        <w:ind w:left="360" w:hanging="360"/>
+        <w:jc w:val="both"/>
+      </w:pPr>
+      <w:r>
+        <w:rPr>
+          <w:rFonts w:ascii="Calibri" w:cs="Calibri" w:eastAsia="Calibri" w:hAnsi="Calibri"/>
+          <w:b/>
+          <w:bCs/>
+          <w:color w:val="1A9E9E"/>
+          <w:sz w:val="20"/>
+          <w:szCs w:val="20"/>
+        </w:rPr>
+        <w:t xml:space="preserve">4.	</w:t>
+      </w:r>
+      <w:r>
+        <w:rPr>
+          <w:rFonts w:ascii="Calibri" w:cs="Calibri" w:eastAsia="Calibri" w:hAnsi="Calibri"/>
+          <w:sz w:val="20"/>
+          <w:szCs w:val="20"/>
+        </w:rPr>
+        <w:t xml:space="preserve">Ouvrez l'onglet « Actions ».</w:t>
       </w:r>
     </w:p>
     <w:p>
@@ -4579,7 +4666,7 @@
           <w:sz w:val="20"/>
           <w:szCs w:val="20"/>
         </w:rPr>
-        <w:t xml:space="preserve">Résultat attendu : le risque figure au registre avec sa criticité avant et après traitement. L'action de traitement apparaît dans le plan d'actions du dossier.</w:t>
+        <w:t xml:space="preserve">Résultat attendu : le risque figure au registre avec sa criticité avant et après traitement. La fenêtre prévient que l'action, confiée au porteur, lui sera notifiée sur le portail. L'action apparaît dans le plan d'actions du dossier.</w:t>
       </w:r>
     </w:p>
     <w:tbl>
@@ -4907,7 +4994,7 @@
           <w:sz w:val="20"/>
           <w:szCs w:val="20"/>
         </w:rPr>
-        <w:t xml:space="preserve">« Nouvelle action » : « Action », « Confiée à » (porteur), « Échéance », « Détail attendu ». Enregistrez.</w:t>
+        <w:t xml:space="preserve">Cadre « Nouvelle action » : « Action », « Confiée à » (porteur), « Échéance », « Détail attendu », puis « Ajouter ».</w:t>
       </w:r>
     </w:p>
     <w:p>
@@ -4979,7 +5066,7 @@
           <w:sz w:val="20"/>
           <w:szCs w:val="20"/>
         </w:rPr>
-        <w:t xml:space="preserve">Résultat attendu : les écarts prioritaires deviennent des actions (« … actions créées »). L'action du porteur passe dans « Déclarées faites, à valider », puis validée avec sa date.</w:t>
+        <w:t xml:space="preserve">Résultat attendu : « … actions créées depuis les écarts prioritaires. », puis « Action ajoutée. ». L'action du porteur passe dans les actions déclarées faites, à valider, puis validée avec sa date et son auteur.</w:t>
       </w:r>
     </w:p>
     <w:tbl>
@@ -5278,7 +5365,7 @@
           <w:sz w:val="20"/>
           <w:szCs w:val="20"/>
         </w:rPr>
-        <w:t xml:space="preserve">Onglet « Financements », « Nouvelle démarche ».</w:t>
+        <w:t xml:space="preserve">Onglet « Financements », cadre « Nouvelle démarche ».</w:t>
       </w:r>
     </w:p>
     <w:p>
@@ -5307,7 +5394,7 @@
           <w:sz w:val="20"/>
           <w:szCs w:val="20"/>
         </w:rPr>
-        <w:t xml:space="preserve">Remplissez « Financeur (banque, fonds, investisseur) », « Instrument », « Montant sollicité (GNF) », la prochaine étape et la « Date de relance ». Enregistrez.</w:t>
+        <w:t xml:space="preserve">Remplissez « Financeur (banque, fonds, investisseur) », « Instrument », « Montant sollicité », la prochaine étape et la « Date de relance », puis « Enregistrer ».</w:t>
       </w:r>
     </w:p>
     <w:p>
@@ -5620,7 +5707,7 @@
           <w:sz w:val="20"/>
           <w:szCs w:val="20"/>
         </w:rPr>
-        <w:t xml:space="preserve">Données : le dossier « Unité de séchage de mangues (démo) », avec deux pièces déposées par le porteur (au besoin, faites-les déposer par test.porteur, POR-04) ; motif « Bilan non signé : merci de déposer la version signée. ».</w:t>
+        <w:t xml:space="preserve">Données : le dossier « Unité de séchage de mangues (démo) », avec deux pièces reçues du porteur (au besoin, faites-les déposer par test.porteur, POR-04) ; motif « Bilan non signé : merci de déposer la version signée. ».</w:t>
       </w:r>
     </w:p>
     <w:p>
@@ -5649,7 +5736,7 @@
           <w:sz w:val="20"/>
           <w:szCs w:val="20"/>
         </w:rPr>
-        <w:t xml:space="preserve">Onglet « Data room ». Sur une pièce reçue, cliquez sur « Valider ».</w:t>
+        <w:t xml:space="preserve">Onglet « Data room », cadre « Pièces standard ». Sur une pièce reçue, cliquez sur « Valider ».</w:t>
       </w:r>
     </w:p>
     <w:p>
@@ -5678,7 +5765,7 @@
           <w:sz w:val="20"/>
           <w:szCs w:val="20"/>
         </w:rPr>
-        <w:t xml:space="preserve">Sur l'autre pièce, cliquez sur « À reprendre », saisissez le motif dans la fenêtre, puis confirmez.</w:t>
+        <w:t xml:space="preserve">Sur l'autre pièce, cliquez sur « À reprendre ». La fenêtre « Reprise de « … » » s'ouvre.</w:t>
       </w:r>
     </w:p>
     <w:p>
@@ -5707,6 +5794,35 @@
           <w:sz w:val="20"/>
           <w:szCs w:val="20"/>
         </w:rPr>
+        <w:t xml:space="preserve">Regardez le bouton « Demander la reprise » tant que le motif est vide, puis saisissez le motif dans « Motif de la reprise, lu par le porteur au portail » et cliquez sur « Demander la reprise ».</w:t>
+      </w:r>
+    </w:p>
+    <w:p>
+      <w:pPr>
+        <w:tabs>
+          <w:tab w:val="left" w:pos="360"/>
+        </w:tabs>
+        <w:spacing w:after="60"/>
+        <w:ind w:left="360" w:hanging="360"/>
+        <w:jc w:val="both"/>
+      </w:pPr>
+      <w:r>
+        <w:rPr>
+          <w:rFonts w:ascii="Calibri" w:cs="Calibri" w:eastAsia="Calibri" w:hAnsi="Calibri"/>
+          <w:b/>
+          <w:bCs/>
+          <w:color w:val="1A9E9E"/>
+          <w:sz w:val="20"/>
+          <w:szCs w:val="20"/>
+        </w:rPr>
+        <w:t xml:space="preserve">4.	</w:t>
+      </w:r>
+      <w:r>
+        <w:rPr>
+          <w:rFonts w:ascii="Calibri" w:cs="Calibri" w:eastAsia="Calibri" w:hAnsi="Calibri"/>
+          <w:sz w:val="20"/>
+          <w:szCs w:val="20"/>
+        </w:rPr>
         <w:t xml:space="preserve">Cliquez sur « Pièces à fournir », puis sur « Data room (.zip) ».</w:t>
       </w:r>
     </w:p>
@@ -5721,7 +5837,7 @@
           <w:sz w:val="20"/>
           <w:szCs w:val="20"/>
         </w:rPr>
-        <w:t xml:space="preserve">Résultat attendu : la première pièce est disponible ; la seconde est comptée « À reprendre » et le porteur lit le motif au portail. « Pièces à fournir » donne la liste imprimable ; l'archive contient la dernière version de chaque pièce, rangée par rubrique, avec un sommaire.</w:t>
+        <w:t xml:space="preserve">Résultat attendu : « … validée. » pour la première pièce. « Demander la reprise » reste grisé sans motif ; ensuite, « … : reprise demandée au porteur. », la pièce est comptée « À reprendre » et le porteur lit le motif au portail. « Pièces à fournir » donne la liste imprimable ; l'archive contient la dernière version de chaque pièce, rangée par rubrique, avec un sommaire.</w:t>
       </w:r>
     </w:p>
     <w:tbl>
@@ -6020,7 +6136,7 @@
           <w:sz w:val="20"/>
           <w:szCs w:val="20"/>
         </w:rPr>
-        <w:t xml:space="preserve">Onglet « Échanges » : choisissez « Message au porteur », écrivez le message, « Envoyer ».</w:t>
+        <w:t xml:space="preserve">Onglet « Échanges » : écrivez le message dans « Message au porteur », puis « Envoyer ».</w:t>
       </w:r>
     </w:p>
     <w:p>
@@ -6049,7 +6165,7 @@
           <w:sz w:val="20"/>
           <w:szCs w:val="20"/>
         </w:rPr>
-        <w:t xml:space="preserve">Choisissez « Note interne au cabinet », écrivez la note, « Envoyer ».</w:t>
+        <w:t xml:space="preserve">Cochez « Note interne au cabinet », écrivez la note, puis « Envoyer ».</w:t>
       </w:r>
     </w:p>
     <w:p>
@@ -6092,7 +6208,7 @@
           <w:sz w:val="20"/>
           <w:szCs w:val="20"/>
         </w:rPr>
-        <w:t xml:space="preserve">Résultat attendu : les deux écrits figurent dans les échanges du dossier, la note marquée « Note interne, invisible du porteur ». Le porteur lit le message, jamais la note.</w:t>
+        <w:t xml:space="preserve">Résultat attendu : « Message envoyé au porteur. », puis « Note interne enregistrée. ». Les deux écrits figurent dans les échanges du dossier, la note marquée comme interne. Le porteur lit le message, jamais la note.</w:t>
       </w:r>
     </w:p>
     <w:tbl>
@@ -6320,7 +6436,7 @@
           <w:sz w:val="22"/>
           <w:szCs w:val="22"/>
         </w:rPr>
-        <w:t xml:space="preserve">AXP-13. Saisir du temps et facturer les honoraires</w:t>
+        <w:t xml:space="preserve">AXP-13. Ouvrir puis retirer l'accès d'un porteur au portail</w:t>
       </w:r>
     </w:p>
     <w:p>
@@ -6334,7 +6450,7 @@
           <w:sz w:val="20"/>
           <w:szCs w:val="20"/>
         </w:rPr>
-        <w:t xml:space="preserve">Objectif : vérifier la saisie des temps et la facture d'honoraires dans la comptabilité du cabinet.</w:t>
+        <w:t xml:space="preserve">Objectif : vérifier l'ouverture du portail à un porteur, le contrôle de l'identifiant et le retrait de l'accès, avec confirmation.</w:t>
       </w:r>
     </w:p>
     <w:p>
@@ -6348,7 +6464,7 @@
           <w:sz w:val="20"/>
           <w:szCs w:val="20"/>
         </w:rPr>
-        <w:t xml:space="preserve">Compte : test.consultant, puis test.daf.</w:t>
+        <w:t xml:space="preserve">Compte : test.consultant.</w:t>
       </w:r>
     </w:p>
     <w:p>
@@ -6362,7 +6478,7 @@
           <w:sz w:val="20"/>
           <w:szCs w:val="20"/>
         </w:rPr>
-        <w:t xml:space="preserve">Données : le dossier de AXP-02 ; 3,5 heures « Analyse du plan d'affaires (essai) » ; taux horaire HT 500 000.</w:t>
+        <w:t xml:space="preserve">Données : le dossier de AXP-02 ; identifiant « essai.porteur.manioc » ; nom « Essai Porteur Manioc » ; un mot de passe provisoire d'essai de votre choix, de 10 caractères au moins ; puis l'identifiant « test.porteur ».</w:t>
       </w:r>
     </w:p>
     <w:p>
@@ -6391,7 +6507,7 @@
           <w:sz w:val="20"/>
           <w:szCs w:val="20"/>
         </w:rPr>
-        <w:t xml:space="preserve">Onglet « Temps », « Saisir du temps » : « Date des travaux », « Heures », « Travaux réalisés », « Enregistrer ».</w:t>
+        <w:t xml:space="preserve">Onglet « Synthèse », cadre « Équipe et accès du porteur au portail ». Saisissez « test.porteur » comme identifiant, un nom, puis « Ouvrir l'accès ».</w:t>
       </w:r>
     </w:p>
     <w:p>
@@ -6420,7 +6536,7 @@
           <w:sz w:val="20"/>
           <w:szCs w:val="20"/>
         </w:rPr>
-        <w:t xml:space="preserve">Cliquez sur « Facturer les honoraires (3,5 h non facturées) ». Saisissez le « Taux horaire HT (GNF) », puis « Créer la facture ».</w:t>
+        <w:t xml:space="preserve">Saisissez l'identifiant « essai.porteur.manioc », le « Nom du porteur » et un mot de passe provisoire de 8 caractères : regardez le message et le bouton.</w:t>
       </w:r>
     </w:p>
     <w:p>
@@ -6449,7 +6565,94 @@
           <w:sz w:val="20"/>
           <w:szCs w:val="20"/>
         </w:rPr>
-        <w:t xml:space="preserve">test.daf : Finance, société MB AxisPro Consulting, Comptabilité &gt; Ventes, vue « Brouillons ».</w:t>
+        <w:t xml:space="preserve">Complétez le mot de passe à 10 caractères au moins, puis « Ouvrir l'accès ».</w:t>
+      </w:r>
+    </w:p>
+    <w:p>
+      <w:pPr>
+        <w:tabs>
+          <w:tab w:val="left" w:pos="360"/>
+        </w:tabs>
+        <w:spacing w:after="60"/>
+        <w:ind w:left="360" w:hanging="360"/>
+        <w:jc w:val="both"/>
+      </w:pPr>
+      <w:r>
+        <w:rPr>
+          <w:rFonts w:ascii="Calibri" w:cs="Calibri" w:eastAsia="Calibri" w:hAnsi="Calibri"/>
+          <w:b/>
+          <w:bCs/>
+          <w:color w:val="1A9E9E"/>
+          <w:sz w:val="20"/>
+          <w:szCs w:val="20"/>
+        </w:rPr>
+        <w:t xml:space="preserve">4.	</w:t>
+      </w:r>
+      <w:r>
+        <w:rPr>
+          <w:rFonts w:ascii="Calibri" w:cs="Calibri" w:eastAsia="Calibri" w:hAnsi="Calibri"/>
+          <w:sz w:val="20"/>
+          <w:szCs w:val="20"/>
+        </w:rPr>
+        <w:t xml:space="preserve">En face du porteur ajouté, cliquez sur « Retirer l'accès ». Lisez la fenêtre « Retirer l'accès au portail », puis « Annuler ».</w:t>
+      </w:r>
+    </w:p>
+    <w:p>
+      <w:pPr>
+        <w:tabs>
+          <w:tab w:val="left" w:pos="360"/>
+        </w:tabs>
+        <w:spacing w:after="60"/>
+        <w:ind w:left="360" w:hanging="360"/>
+        <w:jc w:val="both"/>
+      </w:pPr>
+      <w:r>
+        <w:rPr>
+          <w:rFonts w:ascii="Calibri" w:cs="Calibri" w:eastAsia="Calibri" w:hAnsi="Calibri"/>
+          <w:b/>
+          <w:bCs/>
+          <w:color w:val="1A9E9E"/>
+          <w:sz w:val="20"/>
+          <w:szCs w:val="20"/>
+        </w:rPr>
+        <w:t xml:space="preserve">5.	</w:t>
+      </w:r>
+      <w:r>
+        <w:rPr>
+          <w:rFonts w:ascii="Calibri" w:cs="Calibri" w:eastAsia="Calibri" w:hAnsi="Calibri"/>
+          <w:sz w:val="20"/>
+          <w:szCs w:val="20"/>
+        </w:rPr>
+        <w:t xml:space="preserve">Recommencez et confirmez par « Retirer l'accès ».</w:t>
+      </w:r>
+    </w:p>
+    <w:p>
+      <w:pPr>
+        <w:tabs>
+          <w:tab w:val="left" w:pos="360"/>
+        </w:tabs>
+        <w:spacing w:after="60"/>
+        <w:ind w:left="360" w:hanging="360"/>
+        <w:jc w:val="both"/>
+      </w:pPr>
+      <w:r>
+        <w:rPr>
+          <w:rFonts w:ascii="Calibri" w:cs="Calibri" w:eastAsia="Calibri" w:hAnsi="Calibri"/>
+          <w:b/>
+          <w:bCs/>
+          <w:color w:val="1A9E9E"/>
+          <w:sz w:val="20"/>
+          <w:szCs w:val="20"/>
+        </w:rPr>
+        <w:t xml:space="preserve">6.	</w:t>
+      </w:r>
+      <w:r>
+        <w:rPr>
+          <w:rFonts w:ascii="Calibri" w:cs="Calibri" w:eastAsia="Calibri" w:hAnsi="Calibri"/>
+          <w:sz w:val="20"/>
+          <w:szCs w:val="20"/>
+        </w:rPr>
+        <w:t xml:space="preserve">Ouvrez l'onglet « Journal ».</w:t>
       </w:r>
     </w:p>
     <w:p>
@@ -6463,7 +6666,7 @@
           <w:sz w:val="20"/>
           <w:szCs w:val="20"/>
         </w:rPr>
-        <w:t xml:space="preserve">Résultat attendu : « Facture d'honoraires créée en brouillon (… TTC). ». Le temps passe de « À facturer » à la facture. La facture figure en brouillon dans les ventes de MB AxisPro Consulting, jamais dans celles d'EGUITRA GROUP SARLU.</w:t>
+        <w:t xml:space="preserve">Résultat attendu : à l'étape 1, l'accès est refusé : le compte « test.porteur » suit déjà le dossier d'un autre promoteur, et un compte porteur ne sert qu'un promoteur. À l'étape 2, « 10 caractères au moins. » et « Ouvrir l'accès » grisé. À l'étape 3, « Accès au portail ouvert : le porteur remplacera ce mot de passe provisoire à sa première connexion. ». La fenêtre de l'étape 4 précise que le porteur ne verra plus le dossier et que son compte est désactivé s'il ne suit plus aucun dossier ; « Annuler » ne change rien. À l'étape 5, « Accès de Essai Porteur Manioc retiré. » et « Aucun accès ouvert. ». Le journal garde l'ouverture et le retrait.</w:t>
       </w:r>
     </w:p>
     <w:tbl>
@@ -6691,7 +6894,7 @@
           <w:sz w:val="22"/>
           <w:szCs w:val="22"/>
         </w:rPr>
-        <w:t xml:space="preserve">AXP-14. Télécharger le rapport et les exports</w:t>
+        <w:t xml:space="preserve">AXP-14. Saisir du temps et facturer les honoraires</w:t>
       </w:r>
     </w:p>
     <w:p>
@@ -6705,7 +6908,7 @@
           <w:sz w:val="20"/>
           <w:szCs w:val="20"/>
         </w:rPr>
-        <w:t xml:space="preserve">Objectif : vérifier les documents du dossier pour le comité.</w:t>
+        <w:t xml:space="preserve">Objectif : vérifier la saisie des temps et la facture d'honoraires dans la comptabilité du cabinet.</w:t>
       </w:r>
     </w:p>
     <w:p>
@@ -6719,7 +6922,7 @@
           <w:sz w:val="20"/>
           <w:szCs w:val="20"/>
         </w:rPr>
-        <w:t xml:space="preserve">Compte : test.consultant.</w:t>
+        <w:t xml:space="preserve">Compte : test.consultant, puis test.daf.</w:t>
       </w:r>
     </w:p>
     <w:p>
@@ -6733,7 +6936,7 @@
           <w:sz w:val="20"/>
           <w:szCs w:val="20"/>
         </w:rPr>
-        <w:t xml:space="preserve">Données : le dossier « Usine de briques compressées (démo) ».</w:t>
+        <w:t xml:space="preserve">Données : le dossier de AXP-02 ; 3,5 heures « Analyse du plan d'affaires (essai) » ; taux horaire HT 500 000.</w:t>
       </w:r>
     </w:p>
     <w:p>
@@ -6762,7 +6965,7 @@
           <w:sz w:val="20"/>
           <w:szCs w:val="20"/>
         </w:rPr>
-        <w:t xml:space="preserve">Onglet « Rapport ». Cliquez sur « Rapport du comité (PDF) ».</w:t>
+        <w:t xml:space="preserve">Onglet « Temps », « Saisir du temps » : « Date des travaux », « Heures », « Travaux réalisés », puis « Enregistrer ».</w:t>
       </w:r>
     </w:p>
     <w:p>
@@ -6791,7 +6994,7 @@
           <w:sz w:val="20"/>
           <w:szCs w:val="20"/>
         </w:rPr>
-        <w:t xml:space="preserve">Cliquez sur « Classeur d'évaluation », puis « Pièces à fournir (PDF) ».</w:t>
+        <w:t xml:space="preserve">Cliquez sur « Facturer les honoraires (3,5 h non facturées) ». Saisissez le « Taux horaire HT (GNF) », puis « Créer la facture ».</w:t>
       </w:r>
     </w:p>
     <w:p>
@@ -6820,7 +7023,7 @@
           <w:sz w:val="20"/>
           <w:szCs w:val="20"/>
         </w:rPr>
-        <w:t xml:space="preserve">Cliquez sur « Imprimer l'aperçu ».</w:t>
+        <w:t xml:space="preserve">test.daf : Finance, société MB AxisPro Consulting, Comptabilité &gt; Ventes, vue « Brouillons ».</w:t>
       </w:r>
     </w:p>
     <w:p>
@@ -6834,7 +7037,7 @@
           <w:sz w:val="20"/>
           <w:szCs w:val="20"/>
         </w:rPr>
-        <w:t xml:space="preserve">Résultat attendu : le rapport reprend la fiche, les scores, les gates, les écarts prioritaires, les contrôles, le modèle financier, les risques et la data room. Le classeur suit le plan du modèle du cabinet. Chaque document rappelle la version de la grille.</w:t>
+        <w:t xml:space="preserve">Résultat attendu : « Temps enregistré. », puis « Facture d'honoraires créée en brouillon (… TTC), à valider dans Finance. ». Le temps passe de « À facturer » à la facture. La facture figure en brouillon dans les ventes de MB AxisPro Consulting, jamais dans celles d'EGUITRA GROUP SARLU.</w:t>
       </w:r>
     </w:p>
     <w:tbl>
@@ -7062,7 +7265,7 @@
           <w:sz w:val="22"/>
           <w:szCs w:val="22"/>
         </w:rPr>
-        <w:t xml:space="preserve">AXP-15. Préparer une nouvelle version de la grille</w:t>
+        <w:t xml:space="preserve">AXP-15. Télécharger le rapport et les exports</w:t>
       </w:r>
     </w:p>
     <w:p>
@@ -7076,7 +7279,7 @@
           <w:sz w:val="20"/>
           <w:szCs w:val="20"/>
         </w:rPr>
-        <w:t xml:space="preserve">Objectif : vérifier qu'une modification de la grille passe par une nouvelle version en brouillon, et que sa mise en vigueur est confirmée.</w:t>
+        <w:t xml:space="preserve">Objectif : vérifier les documents du dossier pour le comité.</w:t>
       </w:r>
     </w:p>
     <w:p>
@@ -7090,7 +7293,7 @@
           <w:sz w:val="20"/>
           <w:szCs w:val="20"/>
         </w:rPr>
-        <w:t xml:space="preserve">Compte : test.consultant. Ne pas confirmer la mise en vigueur sans l'accord du cabinet : elle s'applique à tous les dossiers ouverts ensuite.</w:t>
+        <w:t xml:space="preserve">Compte : test.consultant.</w:t>
       </w:r>
     </w:p>
     <w:p>
@@ -7104,7 +7307,7 @@
           <w:sz w:val="20"/>
           <w:szCs w:val="20"/>
         </w:rPr>
-        <w:t xml:space="preserve">Données : la grille en vigueur.</w:t>
+        <w:t xml:space="preserve">Données : le dossier « Usine de briques compressées (démo) ».</w:t>
       </w:r>
     </w:p>
     <w:p>
@@ -7133,7 +7336,7 @@
           <w:sz w:val="20"/>
           <w:szCs w:val="20"/>
         </w:rPr>
-        <w:t xml:space="preserve">Ouvrez Méthode &gt; Grille d'évaluation. Lisez « Versions » et la version « En vigueur ».</w:t>
+        <w:t xml:space="preserve">Onglet « Rapport ». Cliquez sur « Rapport du comité (PDF) ».</w:t>
       </w:r>
     </w:p>
     <w:p>
@@ -7162,7 +7365,7 @@
           <w:sz w:val="20"/>
           <w:szCs w:val="20"/>
         </w:rPr>
-        <w:t xml:space="preserve">Créez une nouvelle version : le message « Nouvelle version créée en brouillon : ajustez-la puis mettez-la en vigueur. » s'affiche.</w:t>
+        <w:t xml:space="preserve">Cliquez sur « Classeur d'évaluation », puis sur « Pièces à fournir (PDF) ».</w:t>
       </w:r>
     </w:p>
     <w:p>
@@ -7191,36 +7394,7 @@
           <w:sz w:val="20"/>
           <w:szCs w:val="20"/>
         </w:rPr>
-        <w:t xml:space="preserve">Dans « Domaines et critères », modifiez l'aide d'un critère.</w:t>
-      </w:r>
-    </w:p>
-    <w:p>
-      <w:pPr>
-        <w:tabs>
-          <w:tab w:val="left" w:pos="360"/>
-        </w:tabs>
-        <w:spacing w:after="60"/>
-        <w:ind w:left="360" w:hanging="360"/>
-        <w:jc w:val="both"/>
-      </w:pPr>
-      <w:r>
-        <w:rPr>
-          <w:rFonts w:ascii="Calibri" w:cs="Calibri" w:eastAsia="Calibri" w:hAnsi="Calibri"/>
-          <w:b/>
-          <w:bCs/>
-          <w:color w:val="1A9E9E"/>
-          <w:sz w:val="20"/>
-          <w:szCs w:val="20"/>
-        </w:rPr>
-        <w:t xml:space="preserve">4.	</w:t>
-      </w:r>
-      <w:r>
-        <w:rPr>
-          <w:rFonts w:ascii="Calibri" w:cs="Calibri" w:eastAsia="Calibri" w:hAnsi="Calibri"/>
-          <w:sz w:val="20"/>
-          <w:szCs w:val="20"/>
-        </w:rPr>
-        <w:t xml:space="preserve">Cliquez sur « Mettre en vigueur », lisez la fenêtre, puis « Annuler ».</w:t>
+        <w:t xml:space="preserve">Cliquez sur « Imprimer l'aperçu ».</w:t>
       </w:r>
     </w:p>
     <w:p>
@@ -7234,7 +7408,7 @@
           <w:sz w:val="20"/>
           <w:szCs w:val="20"/>
         </w:rPr>
-        <w:t xml:space="preserve">Résultat attendu : la version en vigueur ne se modifie pas (« Cette version n'est plus modifiable »). La fenêtre de mise en vigueur précise que la version actuelle sera archivée et que les dossiers ouverts gardent leur version ; « Annuler » ne change rien.</w:t>
+        <w:t xml:space="preserve">Résultat attendu : le rapport reprend la fiche, les scores, les gates, les écarts prioritaires, les contrôles, le modèle financier, les risques et la data room. Le classeur suit le plan du modèle du cabinet. Chaque document rappelle la version de la grille.</w:t>
       </w:r>
     </w:p>
     <w:tbl>
@@ -7451,26 +7625,6 @@
     <w:p>
       <w:pPr>
         <w:keepNext/>
-        <w:pBdr>
-          <w:bottom w:val="single" w:color="1A9E9E" w:sz="6" w:space="2"/>
-        </w:pBdr>
-        <w:spacing w:after="100" w:before="280"/>
-      </w:pPr>
-      <w:r>
-        <w:rPr>
-          <w:rFonts w:ascii="Calibri" w:cs="Calibri" w:eastAsia="Calibri" w:hAnsi="Calibri"/>
-          <w:b/>
-          <w:bCs/>
-          <w:color w:val="1C1E6B"/>
-          <w:sz w:val="26"/>
-          <w:szCs w:val="26"/>
-        </w:rPr>
-        <w:t xml:space="preserve">B. Associé : second regard et décision du comité</w:t>
-      </w:r>
-    </w:p>
-    <w:p>
-      <w:pPr>
-        <w:keepNext/>
         <w:spacing w:after="100" w:before="200"/>
       </w:pPr>
       <w:r>
@@ -7482,7 +7636,7 @@
           <w:sz w:val="22"/>
           <w:szCs w:val="22"/>
         </w:rPr>
-        <w:t xml:space="preserve">AXP-16. Confier un compartiment à un consultant</w:t>
+        <w:t xml:space="preserve">AXP-16. Préparer une nouvelle version de la grille</w:t>
       </w:r>
     </w:p>
     <w:p>
@@ -7496,7 +7650,7 @@
           <w:sz w:val="20"/>
           <w:szCs w:val="20"/>
         </w:rPr>
-        <w:t xml:space="preserve">Objectif : vérifier que le responsable du dossier confie un compartiment et que chacun ne voit que les siens dans « Mes compartiments ».</w:t>
+        <w:t xml:space="preserve">Objectif : vérifier qu'une modification de la grille passe par une nouvelle version en brouillon, et que sa mise en vigueur est confirmée.</w:t>
       </w:r>
     </w:p>
     <w:p>
@@ -7510,7 +7664,7 @@
           <w:sz w:val="20"/>
           <w:szCs w:val="20"/>
         </w:rPr>
-        <w:t xml:space="preserve">Compte : test.consultant (responsable), puis le second compte du cabinet (associé).</w:t>
+        <w:t xml:space="preserve">Compte : test.consultant. Ne confirmez pas la mise en vigueur sans l'accord du cabinet : elle s'applique à tous les dossiers ouverts ensuite.</w:t>
       </w:r>
     </w:p>
     <w:p>
@@ -7524,7 +7678,7 @@
           <w:sz w:val="20"/>
           <w:szCs w:val="20"/>
         </w:rPr>
-        <w:t xml:space="preserve">Données : le dossier de AXP-02 ; compartiment C2 confié à l'associé.</w:t>
+        <w:t xml:space="preserve">Données : la grille en vigueur.</w:t>
       </w:r>
     </w:p>
     <w:p>
@@ -7553,7 +7707,7 @@
           <w:sz w:val="20"/>
           <w:szCs w:val="20"/>
         </w:rPr>
-        <w:t xml:space="preserve">test.consultant : onglet « Synthèse », bloc « Suivi par compartiment ». Dans « Consultant du compartiment C2 », choisissez l'associé.</w:t>
+        <w:t xml:space="preserve">Ouvrez Méthode &gt; Grille d'évaluation. Lisez « Versions » et la version « En vigueur ».</w:t>
       </w:r>
     </w:p>
     <w:p>
@@ -7582,7 +7736,7 @@
           <w:sz w:val="20"/>
           <w:szCs w:val="20"/>
         </w:rPr>
-        <w:t xml:space="preserve">L'associé : ouvrez le dossier, onglet « Évaluation », cliquez sur « Mes compartiments ».</w:t>
+        <w:t xml:space="preserve">Cliquez sur « Nouvelle version ».</w:t>
       </w:r>
     </w:p>
     <w:p>
@@ -7611,7 +7765,36 @@
           <w:sz w:val="20"/>
           <w:szCs w:val="20"/>
         </w:rPr>
-        <w:t xml:space="preserve">L'associé : évaluez un critère du compartiment C2.</w:t>
+        <w:t xml:space="preserve">Dans « Domaines et critères », modifiez l'aide d'un critère.</w:t>
+      </w:r>
+    </w:p>
+    <w:p>
+      <w:pPr>
+        <w:tabs>
+          <w:tab w:val="left" w:pos="360"/>
+        </w:tabs>
+        <w:spacing w:after="60"/>
+        <w:ind w:left="360" w:hanging="360"/>
+        <w:jc w:val="both"/>
+      </w:pPr>
+      <w:r>
+        <w:rPr>
+          <w:rFonts w:ascii="Calibri" w:cs="Calibri" w:eastAsia="Calibri" w:hAnsi="Calibri"/>
+          <w:b/>
+          <w:bCs/>
+          <w:color w:val="1A9E9E"/>
+          <w:sz w:val="20"/>
+          <w:szCs w:val="20"/>
+        </w:rPr>
+        <w:t xml:space="preserve">4.	</w:t>
+      </w:r>
+      <w:r>
+        <w:rPr>
+          <w:rFonts w:ascii="Calibri" w:cs="Calibri" w:eastAsia="Calibri" w:hAnsi="Calibri"/>
+          <w:sz w:val="20"/>
+          <w:szCs w:val="20"/>
+        </w:rPr>
+        <w:t xml:space="preserve">Cliquez sur « Mettre en vigueur », lisez la fenêtre, puis « Annuler ».</w:t>
       </w:r>
     </w:p>
     <w:p>
@@ -7625,7 +7808,7 @@
           <w:sz w:val="20"/>
           <w:szCs w:val="20"/>
         </w:rPr>
-        <w:t xml:space="preserve">Résultat attendu : le message « Compartiment C2 confié à … » s'affiche et le journal du dossier le garde. Avec « Mes compartiments », l'associé ne voit que les critères de C2 ; il les évalue.</w:t>
+        <w:t xml:space="preserve">Résultat attendu : à l'étape 2, « Nouvelle version créée en brouillon : ajustez-la puis mettez-la en vigueur. ». La version en vigueur, elle, ne se modifie pas (« Cette version n'est plus modifiable. … créez une nouvelle version. »). La fenêtre de mise en vigueur précise que la version actuelle sera archivée et que les dossiers ouverts gardent leur version ; « Annuler » ne change rien.</w:t>
       </w:r>
     </w:p>
     <w:tbl>
@@ -7853,7 +8036,7 @@
           <w:sz w:val="22"/>
           <w:szCs w:val="22"/>
         </w:rPr>
-        <w:t xml:space="preserve">AXP-17. Sceller une décision de comité à deux</w:t>
+        <w:t xml:space="preserve">AXP-17. Suspendre, reprendre et clore un dossier</w:t>
       </w:r>
     </w:p>
     <w:p>
@@ -7867,7 +8050,7 @@
           <w:sz w:val="20"/>
           <w:szCs w:val="20"/>
         </w:rPr>
-        <w:t xml:space="preserve">Objectif : vérifier qu'une décision engage au moins deux personnes, qu'elle est confirmée avant d'être scellée et qu'elle fige le dossier.</w:t>
+        <w:t xml:space="preserve">Objectif : vérifier les états du dossier et leur confirmation.</w:t>
       </w:r>
     </w:p>
     <w:p>
@@ -7881,7 +8064,7 @@
           <w:sz w:val="20"/>
           <w:szCs w:val="20"/>
         </w:rPr>
-        <w:t xml:space="preserve">Compte : test.consultant (le dossier ayant aussi été évalué par l'associé en AXP-16).</w:t>
+        <w:t xml:space="preserve">Compte : test.consultant.</w:t>
       </w:r>
     </w:p>
     <w:p>
@@ -7895,7 +8078,7 @@
           <w:sz w:val="20"/>
           <w:szCs w:val="20"/>
         </w:rPr>
-        <w:t xml:space="preserve">Données : le dossier de AXP-02, évalué par les deux comptes (AXP-03 et AXP-16) ; décision HOLD ; instance « Comité d'investissement (essai) » ; motif « Étude de marché à compléter. ».</w:t>
+        <w:t xml:space="preserve">Données : un dossier ouvert pour l'essai (comme en AXP-02, autre que celui des scénarios suivants).</w:t>
       </w:r>
     </w:p>
     <w:p>
@@ -7924,7 +8107,7 @@
           <w:sz w:val="20"/>
           <w:szCs w:val="20"/>
         </w:rPr>
-        <w:t xml:space="preserve">Onglet « Comités », « Nouvelle revue de comité ». Choisissez la « Décision » HOLD, sans motif, puis « Enregistrer en brouillon ».</w:t>
+        <w:t xml:space="preserve">Dans l'en-tête du dossier, à côté de « État du dossier : En cours », cliquez sur « Suspendre ». Lisez la fenêtre, puis confirmez.</w:t>
       </w:r>
     </w:p>
     <w:p>
@@ -7953,7 +8136,7 @@
           <w:sz w:val="20"/>
           <w:szCs w:val="20"/>
         </w:rPr>
-        <w:t xml:space="preserve">Ajoutez le motif dans « Motif de la décision (obligatoire pour HOLD et NO-GO) » et une condition dans « Conditions », puis « Enregistrer en brouillon ».</w:t>
+        <w:t xml:space="preserve">Cliquez sur « Reprendre », confirmez.</w:t>
       </w:r>
     </w:p>
     <w:p>
@@ -7982,7 +8165,7 @@
           <w:sz w:val="20"/>
           <w:szCs w:val="20"/>
         </w:rPr>
-        <w:t xml:space="preserve">Cliquez sur « Enregistrer, sceller et verrouiller » (ou « Verrouiller » sur la revue). Lisez la fenêtre, puis confirmez.</w:t>
+        <w:t xml:space="preserve">Cliquez sur « Clore le dossier ». Lisez la fenêtre, puis confirmez.</w:t>
       </w:r>
     </w:p>
     <w:p>
@@ -8011,7 +8194,7 @@
           <w:sz w:val="20"/>
           <w:szCs w:val="20"/>
         </w:rPr>
-        <w:t xml:space="preserve">Ouvrez l'onglet « Évaluation » et tentez de changer un statut.</w:t>
+        <w:t xml:space="preserve">Ouvrez l'onglet « Évaluation », puis « Stage gates » et « Comités ».</w:t>
       </w:r>
     </w:p>
     <w:p>
@@ -8040,7 +8223,7 @@
           <w:sz w:val="20"/>
           <w:szCs w:val="20"/>
         </w:rPr>
-        <w:t xml:space="preserve">Sur la revue, cliquez sur « Vérifier ».</w:t>
+        <w:t xml:space="preserve">Cliquez sur « Reprendre », confirmez.</w:t>
       </w:r>
     </w:p>
     <w:p>
@@ -8054,7 +8237,7 @@
           <w:sz w:val="20"/>
           <w:szCs w:val="20"/>
         </w:rPr>
-        <w:t xml:space="preserve">Résultat attendu : à l'étape 1, le HOLD sans motif est refusé. À l'étape 3, la fenêtre précise que la décision ne se modifiera plus et fige le dossier jusqu'à une nouvelle révision ; après confirmation, « Décision enregistrée, scellée et verrouillée : le dossier est figé. ». L'évaluation est en lecture seule (« Décision du comité verrouillée : l'évaluation est figée. »). « Vérifier » répond « Décision scellée et verrouillée. ». La condition devient une action du porteur.</w:t>
+        <w:t xml:space="preserve">Résultat attendu : « Dossier suspendu. », « Dossier en cours. », puis « Dossier clos. ». La fenêtre de clôture précise que le dossier ne s'évalue plus, ne passe plus de gate, ne reçoit plus de revue de comité et que le porteur ne peut plus y déposer de pièce ni de message. Clos, le dossier l'indique et « Passer au gate suivant » est grisé. Repris, il redevient « En cours ».</w:t>
       </w:r>
     </w:p>
     <w:tbl>
@@ -8271,6 +8454,26 @@
     <w:p>
       <w:pPr>
         <w:keepNext/>
+        <w:pBdr>
+          <w:bottom w:val="single" w:color="1A9E9E" w:sz="6" w:space="2"/>
+        </w:pBdr>
+        <w:spacing w:after="100" w:before="280"/>
+      </w:pPr>
+      <w:r>
+        <w:rPr>
+          <w:rFonts w:ascii="Calibri" w:cs="Calibri" w:eastAsia="Calibri" w:hAnsi="Calibri"/>
+          <w:b/>
+          <w:bCs/>
+          <w:color w:val="1C1E6B"/>
+          <w:sz w:val="26"/>
+          <w:szCs w:val="26"/>
+        </w:rPr>
+        <w:t xml:space="preserve">B. Associé : second regard et décisions à deux</w:t>
+      </w:r>
+    </w:p>
+    <w:p>
+      <w:pPr>
+        <w:keepNext/>
         <w:spacing w:after="100" w:before="200"/>
       </w:pPr>
       <w:r>
@@ -8282,7 +8485,7 @@
           <w:sz w:val="22"/>
           <w:szCs w:val="22"/>
         </w:rPr>
-        <w:t xml:space="preserve">AXP-18. Ouvrir une nouvelle révision par un autre compte</w:t>
+        <w:t xml:space="preserve">AXP-18. Confier un compartiment à l'associé</w:t>
       </w:r>
     </w:p>
     <w:p>
@@ -8296,7 +8499,7 @@
           <w:sz w:val="20"/>
           <w:szCs w:val="20"/>
         </w:rPr>
-        <w:t xml:space="preserve">Objectif : vérifier que celui qui a verrouillé la décision ne la défait pas lui-même.</w:t>
+        <w:t xml:space="preserve">Objectif : vérifier que le responsable du dossier confie un compartiment et que chacun ne voit que les siens dans « Mes compartiments ».</w:t>
       </w:r>
     </w:p>
     <w:p>
@@ -8310,7 +8513,7 @@
           <w:sz w:val="20"/>
           <w:szCs w:val="20"/>
         </w:rPr>
-        <w:t xml:space="preserve">Compte : le compte qui a verrouillé en AXP-17, puis l'autre compte du cabinet.</w:t>
+        <w:t xml:space="preserve">Compte : test.consultant (responsable), puis test.associe.</w:t>
       </w:r>
     </w:p>
     <w:p>
@@ -8324,7 +8527,7 @@
           <w:sz w:val="20"/>
           <w:szCs w:val="20"/>
         </w:rPr>
-        <w:t xml:space="preserve">Données : le dossier figé de AXP-17.</w:t>
+        <w:t xml:space="preserve">Données : le dossier de AXP-02 ; compartiment C2 confié à test.associe.</w:t>
       </w:r>
     </w:p>
     <w:p>
@@ -8353,7 +8556,7 @@
           <w:sz w:val="20"/>
           <w:szCs w:val="20"/>
         </w:rPr>
-        <w:t xml:space="preserve">Le compte qui a verrouillé : cliquez sur « Ouvrir une nouvelle révision » dans l'en-tête du dossier.</w:t>
+        <w:t xml:space="preserve">test.consultant : onglet « Synthèse », cadre « Suivi par compartiment ». Dans le choix du consultant du compartiment C2, prenez « Test - Associé du cabinet ».</w:t>
       </w:r>
     </w:p>
     <w:p>
@@ -8382,7 +8585,36 @@
           <w:sz w:val="20"/>
           <w:szCs w:val="20"/>
         </w:rPr>
-        <w:t xml:space="preserve">L'autre compte : cliquez sur « Ouvrir une nouvelle révision ».</w:t>
+        <w:t xml:space="preserve">test.associe : ouvrez le dossier, onglet « Évaluation », cliquez sur « Mes compartiments ».</w:t>
+      </w:r>
+    </w:p>
+    <w:p>
+      <w:pPr>
+        <w:tabs>
+          <w:tab w:val="left" w:pos="360"/>
+        </w:tabs>
+        <w:spacing w:after="60"/>
+        <w:ind w:left="360" w:hanging="360"/>
+        <w:jc w:val="both"/>
+      </w:pPr>
+      <w:r>
+        <w:rPr>
+          <w:rFonts w:ascii="Calibri" w:cs="Calibri" w:eastAsia="Calibri" w:hAnsi="Calibri"/>
+          <w:b/>
+          <w:bCs/>
+          <w:color w:val="1A9E9E"/>
+          <w:sz w:val="20"/>
+          <w:szCs w:val="20"/>
+        </w:rPr>
+        <w:t xml:space="preserve">3.	</w:t>
+      </w:r>
+      <w:r>
+        <w:rPr>
+          <w:rFonts w:ascii="Calibri" w:cs="Calibri" w:eastAsia="Calibri" w:hAnsi="Calibri"/>
+          <w:sz w:val="20"/>
+          <w:szCs w:val="20"/>
+        </w:rPr>
+        <w:t xml:space="preserve">test.associe : évaluez un critère du compartiment C2.</w:t>
       </w:r>
     </w:p>
     <w:p>
@@ -8396,7 +8628,7 @@
           <w:sz w:val="20"/>
           <w:szCs w:val="20"/>
         </w:rPr>
-        <w:t xml:space="preserve">Résultat attendu : à l'étape 1, l'ouverture est refusée par un message qui demande un autre compte. À l'étape 2, une nouvelle révision s'ouvre : l'évaluation redevient modifiable ; la décision scellée reste dans l'historique.</w:t>
+        <w:t xml:space="preserve">Résultat attendu : « Compartiment C2 confié à Test - Associé du cabinet. » ; le journal du dossier garde le changement. Avec « Mes compartiments », test.associe ne voit que les critères de C2 et les évalue. Le dossier a désormais deux contributeurs.</w:t>
       </w:r>
     </w:p>
     <w:tbl>
@@ -8624,7 +8856,7 @@
           <w:sz w:val="22"/>
           <w:szCs w:val="22"/>
         </w:rPr>
-        <w:t xml:space="preserve">AXP-19. Comparer deux revues de comité</w:t>
+        <w:t xml:space="preserve">AXP-19. Forcer le passage d'un gate, avec un motif</w:t>
       </w:r>
     </w:p>
     <w:p>
@@ -8638,7 +8870,7 @@
           <w:sz w:val="20"/>
           <w:szCs w:val="20"/>
         </w:rPr>
-        <w:t xml:space="preserve">Objectif : vérifier la comparaison de deux décisions.</w:t>
+        <w:t xml:space="preserve">Objectif : vérifier qu'un passage contre la règle exige un motif et deux personnes, et qu'il est inscrit au journal.</w:t>
       </w:r>
     </w:p>
     <w:p>
@@ -8652,7 +8884,7 @@
           <w:sz w:val="20"/>
           <w:szCs w:val="20"/>
         </w:rPr>
-        <w:t xml:space="preserve">Compte : test.consultant.</w:t>
+        <w:t xml:space="preserve">Compte : test.consultant (le dossier ayant été évalué aussi par test.associe en AXP-18).</w:t>
       </w:r>
     </w:p>
     <w:p>
@@ -8666,7 +8898,7 @@
           <w:sz w:val="20"/>
           <w:szCs w:val="20"/>
         </w:rPr>
-        <w:t xml:space="preserve">Données : un dossier avec deux revues (par exemple après une seconde décision sur la révision de AXP-18).</w:t>
+        <w:t xml:space="preserve">Données : le dossier de AXP-02, dont le gate en cours refuse le passage ; motif « Décision du comité du 15, pièce attendue sous huit jours (essai). ».</w:t>
       </w:r>
     </w:p>
     <w:p>
@@ -8695,7 +8927,7 @@
           <w:sz w:val="20"/>
           <w:szCs w:val="20"/>
         </w:rPr>
-        <w:t xml:space="preserve">Onglet « Comités », « Historique (cochez deux revues pour les comparer) » : cochez « Comparer cette revue » sur deux revues.</w:t>
+        <w:t xml:space="preserve">Onglet « Stage gates », « Passer au gate suivant ». La fenêtre « Passage contre la règle du gate » s'ouvre.</w:t>
       </w:r>
     </w:p>
     <w:p>
@@ -8724,7 +8956,65 @@
           <w:sz w:val="20"/>
           <w:szCs w:val="20"/>
         </w:rPr>
-        <w:t xml:space="preserve">Lisez la « Comparaison du … au … ».</w:t>
+        <w:t xml:space="preserve">Saisissez un motif de moins de dix caractères dans « Motif du passage forcé (10 caractères au moins) », puis le motif complet.</w:t>
+      </w:r>
+    </w:p>
+    <w:p>
+      <w:pPr>
+        <w:tabs>
+          <w:tab w:val="left" w:pos="360"/>
+        </w:tabs>
+        <w:spacing w:after="60"/>
+        <w:ind w:left="360" w:hanging="360"/>
+        <w:jc w:val="both"/>
+      </w:pPr>
+      <w:r>
+        <w:rPr>
+          <w:rFonts w:ascii="Calibri" w:cs="Calibri" w:eastAsia="Calibri" w:hAnsi="Calibri"/>
+          <w:b/>
+          <w:bCs/>
+          <w:color w:val="1A9E9E"/>
+          <w:sz w:val="20"/>
+          <w:szCs w:val="20"/>
+        </w:rPr>
+        <w:t xml:space="preserve">3.	</w:t>
+      </w:r>
+      <w:r>
+        <w:rPr>
+          <w:rFonts w:ascii="Calibri" w:cs="Calibri" w:eastAsia="Calibri" w:hAnsi="Calibri"/>
+          <w:sz w:val="20"/>
+          <w:szCs w:val="20"/>
+        </w:rPr>
+        <w:t xml:space="preserve">Cliquez sur « Forcer le passage ».</w:t>
+      </w:r>
+    </w:p>
+    <w:p>
+      <w:pPr>
+        <w:tabs>
+          <w:tab w:val="left" w:pos="360"/>
+        </w:tabs>
+        <w:spacing w:after="60"/>
+        <w:ind w:left="360" w:hanging="360"/>
+        <w:jc w:val="both"/>
+      </w:pPr>
+      <w:r>
+        <w:rPr>
+          <w:rFonts w:ascii="Calibri" w:cs="Calibri" w:eastAsia="Calibri" w:hAnsi="Calibri"/>
+          <w:b/>
+          <w:bCs/>
+          <w:color w:val="1A9E9E"/>
+          <w:sz w:val="20"/>
+          <w:szCs w:val="20"/>
+        </w:rPr>
+        <w:t xml:space="preserve">4.	</w:t>
+      </w:r>
+      <w:r>
+        <w:rPr>
+          <w:rFonts w:ascii="Calibri" w:cs="Calibri" w:eastAsia="Calibri" w:hAnsi="Calibri"/>
+          <w:sz w:val="20"/>
+          <w:szCs w:val="20"/>
+        </w:rPr>
+        <w:t xml:space="preserve">Ouvrez l'onglet « Journal ».</w:t>
       </w:r>
     </w:p>
     <w:p>
@@ -8738,7 +9028,7 @@
           <w:sz w:val="20"/>
           <w:szCs w:val="20"/>
         </w:rPr>
-        <w:t xml:space="preserve">Résultat attendu : la comparaison montre l'évolution des scores, des gates, des domaines et des indicateurs financiers entre les deux revues.</w:t>
+        <w:t xml:space="preserve">Résultat attendu : « Forcer le passage » reste grisé tant que le motif compte moins de dix caractères. Ensuite, « Passage forcé enregistré au journal du dossier. » : le dossier passe au gate suivant. Le journal porte le motif, son auteur et la décision calculée ; le rapport le reprendra.</w:t>
       </w:r>
     </w:p>
     <w:tbl>
@@ -8955,26 +9245,6 @@
     <w:p>
       <w:pPr>
         <w:keepNext/>
-        <w:pBdr>
-          <w:bottom w:val="single" w:color="1A9E9E" w:sz="6" w:space="2"/>
-        </w:pBdr>
-        <w:spacing w:after="100" w:before="280"/>
-      </w:pPr>
-      <w:r>
-        <w:rPr>
-          <w:rFonts w:ascii="Calibri" w:cs="Calibri" w:eastAsia="Calibri" w:hAnsi="Calibri"/>
-          <w:b/>
-          <w:bCs/>
-          <w:color w:val="1C1E6B"/>
-          <w:sz w:val="26"/>
-          <w:szCs w:val="26"/>
-        </w:rPr>
-        <w:t xml:space="preserve">C. Outils du portail des porteurs (cabinet)</w:t>
-      </w:r>
-    </w:p>
-    <w:p>
-      <w:pPr>
-        <w:keepNext/>
         <w:spacing w:after="100" w:before="200"/>
       </w:pPr>
       <w:r>
@@ -8986,7 +9256,7 @@
           <w:sz w:val="22"/>
           <w:szCs w:val="22"/>
         </w:rPr>
-        <w:t xml:space="preserve">AXP-20. Lire la synthèse du portail</w:t>
+        <w:t xml:space="preserve">AXP-20. Sceller une décision de comité à deux</w:t>
       </w:r>
     </w:p>
     <w:p>
@@ -9000,7 +9270,7 @@
           <w:sz w:val="20"/>
           <w:szCs w:val="20"/>
         </w:rPr>
-        <w:t xml:space="preserve">Objectif : vérifier que le cabinet voit ce qui l'attend sur le portail.</w:t>
+        <w:t xml:space="preserve">Objectif : vérifier qu'une décision HOLD exige un motif, qu'elle est confirmée avant d'être scellée, et qu'elle fige le dossier.</w:t>
       </w:r>
     </w:p>
     <w:p>
@@ -9014,7 +9284,7 @@
           <w:sz w:val="20"/>
           <w:szCs w:val="20"/>
         </w:rPr>
-        <w:t xml:space="preserve">Compte : test.consultant.</w:t>
+        <w:t xml:space="preserve">Compte : test.consultant (le dossier ayant été évalué aussi par test.associe en AXP-18).</w:t>
       </w:r>
     </w:p>
     <w:p>
@@ -9028,7 +9298,7 @@
           <w:sz w:val="20"/>
           <w:szCs w:val="20"/>
         </w:rPr>
-        <w:t xml:space="preserve">Données : aucune.</w:t>
+        <w:t xml:space="preserve">Données : le dossier de AXP-02 ; décision HOLD ; motif « Étude de marché à compléter. » ; une condition « Déposer l'étude de marché (essai) ».</w:t>
       </w:r>
     </w:p>
     <w:p>
@@ -9057,7 +9327,7 @@
           <w:sz w:val="20"/>
           <w:szCs w:val="20"/>
         </w:rPr>
-        <w:t xml:space="preserve">Ouvrez Cabinet &gt; Portail des porteurs. Les onglets « Synthèse », « Messages », « Communications », « Ressources », « Événements », « Rendez-vous », « Porteurs et avis » s'affichent.</w:t>
+        <w:t xml:space="preserve">Onglet « Comités », cadre « Nouvelle revue de comité ». Choisissez la « Décision » HOLD, laissez le motif vide et regardez les boutons.</w:t>
       </w:r>
     </w:p>
     <w:p>
@@ -9086,7 +9356,94 @@
           <w:sz w:val="20"/>
           <w:szCs w:val="20"/>
         </w:rPr>
-        <w:t xml:space="preserve">Lisez la synthèse : porteurs actifs, messages en attente, rendez-vous demandés, comptes rendus à valider, inscriptions, satisfaction.</w:t>
+        <w:t xml:space="preserve">Saisissez le motif dans « Motif de la décision (obligatoire pour HOLD et NO-GO) » et la condition dans « Conditions », puis « Enregistrer en brouillon ».</w:t>
+      </w:r>
+    </w:p>
+    <w:p>
+      <w:pPr>
+        <w:tabs>
+          <w:tab w:val="left" w:pos="360"/>
+        </w:tabs>
+        <w:spacing w:after="60"/>
+        <w:ind w:left="360" w:hanging="360"/>
+        <w:jc w:val="both"/>
+      </w:pPr>
+      <w:r>
+        <w:rPr>
+          <w:rFonts w:ascii="Calibri" w:cs="Calibri" w:eastAsia="Calibri" w:hAnsi="Calibri"/>
+          <w:b/>
+          <w:bCs/>
+          <w:color w:val="1A9E9E"/>
+          <w:sz w:val="20"/>
+          <w:szCs w:val="20"/>
+        </w:rPr>
+        <w:t xml:space="preserve">3.	</w:t>
+      </w:r>
+      <w:r>
+        <w:rPr>
+          <w:rFonts w:ascii="Calibri" w:cs="Calibri" w:eastAsia="Calibri" w:hAnsi="Calibri"/>
+          <w:sz w:val="20"/>
+          <w:szCs w:val="20"/>
+        </w:rPr>
+        <w:t xml:space="preserve">Sur la revue, cliquez sur « Verrouiller ». Lisez la fenêtre « Sceller et verrouiller la décision », puis « Sceller et verrouiller ».</w:t>
+      </w:r>
+    </w:p>
+    <w:p>
+      <w:pPr>
+        <w:tabs>
+          <w:tab w:val="left" w:pos="360"/>
+        </w:tabs>
+        <w:spacing w:after="60"/>
+        <w:ind w:left="360" w:hanging="360"/>
+        <w:jc w:val="both"/>
+      </w:pPr>
+      <w:r>
+        <w:rPr>
+          <w:rFonts w:ascii="Calibri" w:cs="Calibri" w:eastAsia="Calibri" w:hAnsi="Calibri"/>
+          <w:b/>
+          <w:bCs/>
+          <w:color w:val="1A9E9E"/>
+          <w:sz w:val="20"/>
+          <w:szCs w:val="20"/>
+        </w:rPr>
+        <w:t xml:space="preserve">4.	</w:t>
+      </w:r>
+      <w:r>
+        <w:rPr>
+          <w:rFonts w:ascii="Calibri" w:cs="Calibri" w:eastAsia="Calibri" w:hAnsi="Calibri"/>
+          <w:sz w:val="20"/>
+          <w:szCs w:val="20"/>
+        </w:rPr>
+        <w:t xml:space="preserve">Ouvrez l'onglet « Évaluation » et tentez de changer un statut.</w:t>
+      </w:r>
+    </w:p>
+    <w:p>
+      <w:pPr>
+        <w:tabs>
+          <w:tab w:val="left" w:pos="360"/>
+        </w:tabs>
+        <w:spacing w:after="60"/>
+        <w:ind w:left="360" w:hanging="360"/>
+        <w:jc w:val="both"/>
+      </w:pPr>
+      <w:r>
+        <w:rPr>
+          <w:rFonts w:ascii="Calibri" w:cs="Calibri" w:eastAsia="Calibri" w:hAnsi="Calibri"/>
+          <w:b/>
+          <w:bCs/>
+          <w:color w:val="1A9E9E"/>
+          <w:sz w:val="20"/>
+          <w:szCs w:val="20"/>
+        </w:rPr>
+        <w:t xml:space="preserve">5.	</w:t>
+      </w:r>
+      <w:r>
+        <w:rPr>
+          <w:rFonts w:ascii="Calibri" w:cs="Calibri" w:eastAsia="Calibri" w:hAnsi="Calibri"/>
+          <w:sz w:val="20"/>
+          <w:szCs w:val="20"/>
+        </w:rPr>
+        <w:t xml:space="preserve">Revenez à « Comités » et cliquez sur « Vérifier » sur la revue.</w:t>
       </w:r>
     </w:p>
     <w:p>
@@ -9100,7 +9457,7 @@
           <w:sz w:val="20"/>
           <w:szCs w:val="20"/>
         </w:rPr>
-        <w:t xml:space="preserve">Résultat attendu : chaque chiffre renvoie à l'onglet où agir ; la liste dit ce qui attend le cabinet.</w:t>
+        <w:t xml:space="preserve">Résultat attendu : à l'étape 1, « Motif obligatoire pour une décision HOLD ou NO-GO, dès le brouillon. » et les deux boutons d'enregistrement sont grisés. À l'étape 2, « Revue enregistrée en brouillon : elle se corrige jusqu'à son verrouillage. ». La fenêtre de l'étape 3 précise que la décision ne se modifiera plus et fige le dossier jusqu'à une nouvelle révision, ouverte par un autre compte ; après confirmation, « Décision scellée et verrouillée. ». L'évaluation est figée (« Décision du comité verrouillée : l'évaluation est figée. … »). « Vérifier » répond « Empreinte valide, dossier inchangé depuis la décision : … ». La condition devient une action du porteur.</w:t>
       </w:r>
     </w:p>
     <w:tbl>
@@ -9328,7 +9685,7 @@
           <w:sz w:val="22"/>
           <w:szCs w:val="22"/>
         </w:rPr>
-        <w:t xml:space="preserve">AXP-21. Répondre à un porteur depuis la messagerie du cabinet</w:t>
+        <w:t xml:space="preserve">AXP-21. Ouvrir une nouvelle révision par un autre compte</w:t>
       </w:r>
     </w:p>
     <w:p>
@@ -9342,7 +9699,7 @@
           <w:sz w:val="20"/>
           <w:szCs w:val="20"/>
         </w:rPr>
-        <w:t xml:space="preserve">Objectif : vérifier la messagerie de tous les dossiers et la note interne.</w:t>
+        <w:t xml:space="preserve">Objectif : vérifier que celui qui a verrouillé la décision ne la défait pas lui-même.</w:t>
       </w:r>
     </w:p>
     <w:p>
@@ -9356,7 +9713,7 @@
           <w:sz w:val="20"/>
           <w:szCs w:val="20"/>
         </w:rPr>
-        <w:t xml:space="preserve">Compte : test.consultant, puis test.porteur.</w:t>
+        <w:t xml:space="preserve">Compte : test.consultant (qui a verrouillé en AXP-20), puis test.associe.</w:t>
       </w:r>
     </w:p>
     <w:p>
@@ -9370,7 +9727,7 @@
           <w:sz w:val="20"/>
           <w:szCs w:val="20"/>
         </w:rPr>
-        <w:t xml:space="preserve">Données : un message envoyé par test.porteur (POR-06).</w:t>
+        <w:t xml:space="preserve">Données : le dossier figé de AXP-20.</w:t>
       </w:r>
     </w:p>
     <w:p>
@@ -9399,7 +9756,7 @@
           <w:sz w:val="20"/>
           <w:szCs w:val="20"/>
         </w:rPr>
-        <w:t xml:space="preserve">Onglet « Messages ». Choisissez « Non lues », puis la conversation de test.porteur.</w:t>
+        <w:t xml:space="preserve">test.consultant : dans l'en-tête du dossier, cliquez sur « Ouvrir une nouvelle révision ». Lisez la fenêtre, puis « Ouvrir la révision ».</w:t>
       </w:r>
     </w:p>
     <w:p>
@@ -9428,65 +9785,7 @@
           <w:sz w:val="20"/>
           <w:szCs w:val="20"/>
         </w:rPr>
-        <w:t xml:space="preserve">Écrivez une réponse dans « Votre réponse au porteur… », envoyez (Ctrl + Entrée).</w:t>
-      </w:r>
-    </w:p>
-    <w:p>
-      <w:pPr>
-        <w:tabs>
-          <w:tab w:val="left" w:pos="360"/>
-        </w:tabs>
-        <w:spacing w:after="60"/>
-        <w:ind w:left="360" w:hanging="360"/>
-        <w:jc w:val="both"/>
-      </w:pPr>
-      <w:r>
-        <w:rPr>
-          <w:rFonts w:ascii="Calibri" w:cs="Calibri" w:eastAsia="Calibri" w:hAnsi="Calibri"/>
-          <w:b/>
-          <w:bCs/>
-          <w:color w:val="1A9E9E"/>
-          <w:sz w:val="20"/>
-          <w:szCs w:val="20"/>
-        </w:rPr>
-        <w:t xml:space="preserve">3.	</w:t>
-      </w:r>
-      <w:r>
-        <w:rPr>
-          <w:rFonts w:ascii="Calibri" w:cs="Calibri" w:eastAsia="Calibri" w:hAnsi="Calibri"/>
-          <w:sz w:val="20"/>
-          <w:szCs w:val="20"/>
-        </w:rPr>
-        <w:t xml:space="preserve">Cochez « Note interne », écrivez une note, puis « Enregistrer la note ».</w:t>
-      </w:r>
-    </w:p>
-    <w:p>
-      <w:pPr>
-        <w:tabs>
-          <w:tab w:val="left" w:pos="360"/>
-        </w:tabs>
-        <w:spacing w:after="60"/>
-        <w:ind w:left="360" w:hanging="360"/>
-        <w:jc w:val="both"/>
-      </w:pPr>
-      <w:r>
-        <w:rPr>
-          <w:rFonts w:ascii="Calibri" w:cs="Calibri" w:eastAsia="Calibri" w:hAnsi="Calibri"/>
-          <w:b/>
-          <w:bCs/>
-          <w:color w:val="1A9E9E"/>
-          <w:sz w:val="20"/>
-          <w:szCs w:val="20"/>
-        </w:rPr>
-        <w:t xml:space="preserve">4.	</w:t>
-      </w:r>
-      <w:r>
-        <w:rPr>
-          <w:rFonts w:ascii="Calibri" w:cs="Calibri" w:eastAsia="Calibri" w:hAnsi="Calibri"/>
-          <w:sz w:val="20"/>
-          <w:szCs w:val="20"/>
-        </w:rPr>
-        <w:t xml:space="preserve">test.porteur : lisez ses messages.</w:t>
+        <w:t xml:space="preserve">test.associe : faites de même.</w:t>
       </w:r>
     </w:p>
     <w:p>
@@ -9500,7 +9799,7 @@
           <w:sz w:val="20"/>
           <w:szCs w:val="20"/>
         </w:rPr>
-        <w:t xml:space="preserve">Résultat attendu : la conversation est signalée « En attente de réponse » avant la réponse. Le porteur lit la réponse, jamais la note interne.</w:t>
+        <w:t xml:space="preserve">Résultat attendu : la fenêtre rappelle que la décision scellée reste au dossier et que celui qui l'a verrouillée ne peut pas ouvrir la révision. À l'étape 1, refus : « Principe des quatre yeux : vous avez verrouillé la décision en vigueur du dossier … (révision …), vous ne pouvez donc pas ouvrir la nouvelle révision qui la défait. Un autre consultant du cabinet doit l'ouvrir. ». À l'étape 2, « Nouvelle révision ouverte : le dossier est de nouveau modifiable. » ; la décision scellée reste dans l'historique.</w:t>
       </w:r>
     </w:p>
     <w:tbl>
@@ -9728,7 +10027,7 @@
           <w:sz w:val="22"/>
           <w:szCs w:val="22"/>
         </w:rPr>
-        <w:t xml:space="preserve">AXP-22. Publier une communication avec accusé de lecture</w:t>
+        <w:t xml:space="preserve">AXP-22. Comparer deux revues de comité</w:t>
       </w:r>
     </w:p>
     <w:p>
@@ -9742,7 +10041,7 @@
           <w:sz w:val="20"/>
           <w:szCs w:val="20"/>
         </w:rPr>
-        <w:t xml:space="preserve">Objectif : vérifier la publication d'une communication à un public choisi et le suivi de sa lecture.</w:t>
+        <w:t xml:space="preserve">Objectif : vérifier la comparaison de deux décisions.</w:t>
       </w:r>
     </w:p>
     <w:p>
@@ -9756,7 +10055,7 @@
           <w:sz w:val="20"/>
           <w:szCs w:val="20"/>
         </w:rPr>
-        <w:t xml:space="preserve">Compte : test.consultant, puis test.porteur.</w:t>
+        <w:t xml:space="preserve">Compte : test.consultant.</w:t>
       </w:r>
     </w:p>
     <w:p>
@@ -9770,7 +10069,7 @@
           <w:sz w:val="20"/>
           <w:szCs w:val="20"/>
         </w:rPr>
-        <w:t xml:space="preserve">Données : titre « Appel à projets agricole (essai) » ; public : le dossier « Unité de séchage de mangues (démo) » ; accusé de lecture demandé.</w:t>
+        <w:t xml:space="preserve">Données : le dossier de AXP-21, avec une seconde revue enregistrée sur la nouvelle révision.</w:t>
       </w:r>
     </w:p>
     <w:p>
@@ -9799,7 +10098,7 @@
           <w:sz w:val="20"/>
           <w:szCs w:val="20"/>
         </w:rPr>
-        <w:t xml:space="preserve">Onglet « Communications », « Nouvelle communication » : « Titre », « Nature », « Texte », le public et l'accusé de lecture. « Enregistrer le brouillon ».</w:t>
+        <w:t xml:space="preserve">Onglet « Comités » : enregistrez une seconde revue en brouillon (par exemple CONDITIONAL GO).</w:t>
       </w:r>
     </w:p>
     <w:p>
@@ -9828,7 +10127,7 @@
           <w:sz w:val="20"/>
           <w:szCs w:val="20"/>
         </w:rPr>
-        <w:t xml:space="preserve">Sur la communication, cliquez sur « Publier », lisez la fenêtre « Publier … ? », puis confirmez.</w:t>
+        <w:t xml:space="preserve">Dans l'historique, cochez les deux revues.</w:t>
       </w:r>
     </w:p>
     <w:p>
@@ -9857,36 +10156,7 @@
           <w:sz w:val="20"/>
           <w:szCs w:val="20"/>
         </w:rPr>
-        <w:t xml:space="preserve">test.porteur : ouvrez « Actualités », lisez la communication, confirmez la lecture.</w:t>
-      </w:r>
-    </w:p>
-    <w:p>
-      <w:pPr>
-        <w:tabs>
-          <w:tab w:val="left" w:pos="360"/>
-        </w:tabs>
-        <w:spacing w:after="60"/>
-        <w:ind w:left="360" w:hanging="360"/>
-        <w:jc w:val="both"/>
-      </w:pPr>
-      <w:r>
-        <w:rPr>
-          <w:rFonts w:ascii="Calibri" w:cs="Calibri" w:eastAsia="Calibri" w:hAnsi="Calibri"/>
-          <w:b/>
-          <w:bCs/>
-          <w:color w:val="1A9E9E"/>
-          <w:sz w:val="20"/>
-          <w:szCs w:val="20"/>
-        </w:rPr>
-        <w:t xml:space="preserve">4.	</w:t>
-      </w:r>
-      <w:r>
-        <w:rPr>
-          <w:rFonts w:ascii="Calibri" w:cs="Calibri" w:eastAsia="Calibri" w:hAnsi="Calibri"/>
-          <w:sz w:val="20"/>
-          <w:szCs w:val="20"/>
-        </w:rPr>
-        <w:t xml:space="preserve">test.consultant : relisez la communication (« Lue », « Accusés »).</w:t>
+        <w:t xml:space="preserve">Lisez la « Comparaison du … au … ».</w:t>
       </w:r>
     </w:p>
     <w:p>
@@ -9900,7 +10170,7 @@
           <w:sz w:val="20"/>
           <w:szCs w:val="20"/>
         </w:rPr>
-        <w:t xml:space="preserve">Résultat attendu : « Communication publiée : les porteurs visés sont prévenus. ». Le porteur la voit avec une notification ; après sa confirmation, le cabinet voit l'accusé.</w:t>
+        <w:t xml:space="preserve">Résultat attendu : la comparaison montre l'évolution des scores, des gates, des domaines et des indicateurs financiers entre les deux revues.</w:t>
       </w:r>
     </w:p>
     <w:tbl>
@@ -10128,7 +10398,7 @@
           <w:sz w:val="22"/>
           <w:szCs w:val="22"/>
         </w:rPr>
-        <w:t xml:space="preserve">AXP-23. Confirmer un rendez-vous demandé par un porteur</w:t>
+        <w:t xml:space="preserve">AXP-23. Changer de responsable du dossier</w:t>
       </w:r>
     </w:p>
     <w:p>
@@ -10142,7 +10412,7 @@
           <w:sz w:val="20"/>
           <w:szCs w:val="20"/>
         </w:rPr>
-        <w:t xml:space="preserve">Objectif : vérifier la réponse du cabinet à une demande de rendez-vous et le compte rendu partagé.</w:t>
+        <w:t xml:space="preserve">Objectif : vérifier que seul le responsable en place confie le dossier à un autre consultant, avec confirmation.</w:t>
       </w:r>
     </w:p>
     <w:p>
@@ -10156,7 +10426,7 @@
           <w:sz w:val="20"/>
           <w:szCs w:val="20"/>
         </w:rPr>
-        <w:t xml:space="preserve">Compte : test.consultant, puis test.porteur.</w:t>
+        <w:t xml:space="preserve">Compte : test.consultant (responsable), puis test.associe.</w:t>
       </w:r>
     </w:p>
     <w:p>
@@ -10170,7 +10440,7 @@
           <w:sz w:val="20"/>
           <w:szCs w:val="20"/>
         </w:rPr>
-        <w:t xml:space="preserve">Données : une demande de rendez-vous de test.porteur (POR-09).</w:t>
+        <w:t xml:space="preserve">Données : le dossier de AXP-02, non figé (après AXP-21).</w:t>
       </w:r>
     </w:p>
     <w:p>
@@ -10199,7 +10469,7 @@
           <w:sz w:val="20"/>
           <w:szCs w:val="20"/>
         </w:rPr>
-        <w:t xml:space="preserve">Onglet « Rendez-vous », bloc « À confirmer ou à décliner » : ouvrez la demande.</w:t>
+        <w:t xml:space="preserve">test.consultant : onglet « Synthèse », cadre « Équipe et accès du porteur au portail ». Dans « Confier à un autre consultant », choisissez « Test - Associé du cabinet », puis « Confier le dossier ».</w:t>
       </w:r>
     </w:p>
     <w:p>
@@ -10228,7 +10498,7 @@
           <w:sz w:val="20"/>
           <w:szCs w:val="20"/>
         </w:rPr>
-        <w:t xml:space="preserve">Cliquez sur un des « Créneaux proposés par le porteur », renseignez le « Lieu », confirmez.</w:t>
+        <w:t xml:space="preserve">Lisez la fenêtre « Changer de responsable », puis « Confier le dossier ».</w:t>
       </w:r>
     </w:p>
     <w:p>
@@ -10257,7 +10527,36 @@
           <w:sz w:val="20"/>
           <w:szCs w:val="20"/>
         </w:rPr>
-        <w:t xml:space="preserve">Le jour venu (ou sur un rendez-vous passé), « Marquer tenu » avec un compte rendu.</w:t>
+        <w:t xml:space="preserve">test.consultant : rechargez la synthèse.</w:t>
+      </w:r>
+    </w:p>
+    <w:p>
+      <w:pPr>
+        <w:tabs>
+          <w:tab w:val="left" w:pos="360"/>
+        </w:tabs>
+        <w:spacing w:after="60"/>
+        <w:ind w:left="360" w:hanging="360"/>
+        <w:jc w:val="both"/>
+      </w:pPr>
+      <w:r>
+        <w:rPr>
+          <w:rFonts w:ascii="Calibri" w:cs="Calibri" w:eastAsia="Calibri" w:hAnsi="Calibri"/>
+          <w:b/>
+          <w:bCs/>
+          <w:color w:val="1A9E9E"/>
+          <w:sz w:val="20"/>
+          <w:szCs w:val="20"/>
+        </w:rPr>
+        <w:t xml:space="preserve">4.	</w:t>
+      </w:r>
+      <w:r>
+        <w:rPr>
+          <w:rFonts w:ascii="Calibri" w:cs="Calibri" w:eastAsia="Calibri" w:hAnsi="Calibri"/>
+          <w:sz w:val="20"/>
+          <w:szCs w:val="20"/>
+        </w:rPr>
+        <w:t xml:space="preserve">test.associe : confiez de nouveau le dossier à « Test - Consultant du cabinet ».</w:t>
       </w:r>
     </w:p>
     <w:p>
@@ -10271,7 +10570,7 @@
           <w:sz w:val="20"/>
           <w:szCs w:val="20"/>
         </w:rPr>
-        <w:t xml:space="preserve">Résultat attendu : « Rendez-vous confirmé : le porteur est prévenu. » ; le rendez-vous passe dans « Confirmés à venir ». Marqué tenu, son compte rendu est lisible par le porteur.</w:t>
+        <w:t xml:space="preserve">Résultat attendu : la fenêtre précise que le nouveau responsable confiera seul ensuite les compartiments et le dossier. « Dossier confié à Test - Associé du cabinet. » ; le cadre indique le nouveau responsable et le journal garde le changement. À l'étape 3, test.consultant ne peut plus confier le dossier (le choix n'est plus proposé). À l'étape 4, le dossier revient à test.consultant. Sur un dossier figé, le bouton est grisé : « Figé par la décision verrouillée, comme la fiche. ».</w:t>
       </w:r>
     </w:p>
     <w:tbl>
@@ -10488,6 +10787,26 @@
     <w:p>
       <w:pPr>
         <w:keepNext/>
+        <w:pBdr>
+          <w:bottom w:val="single" w:color="1A9E9E" w:sz="6" w:space="2"/>
+        </w:pBdr>
+        <w:spacing w:after="100" w:before="280"/>
+      </w:pPr>
+      <w:r>
+        <w:rPr>
+          <w:rFonts w:ascii="Calibri" w:cs="Calibri" w:eastAsia="Calibri" w:hAnsi="Calibri"/>
+          <w:b/>
+          <w:bCs/>
+          <w:color w:val="1C1E6B"/>
+          <w:sz w:val="26"/>
+          <w:szCs w:val="26"/>
+        </w:rPr>
+        <w:t xml:space="preserve">C. Outils du portail des porteurs (cabinet)</w:t>
+      </w:r>
+    </w:p>
+    <w:p>
+      <w:pPr>
+        <w:keepNext/>
         <w:spacing w:after="100" w:before="200"/>
       </w:pPr>
       <w:r>
@@ -10499,7 +10818,7 @@
           <w:sz w:val="22"/>
           <w:szCs w:val="22"/>
         </w:rPr>
-        <w:t xml:space="preserve">AXP-24. Publier un événement et gérer les inscriptions</w:t>
+        <w:t xml:space="preserve">AXP-24. Lire la synthèse du portail</w:t>
       </w:r>
     </w:p>
     <w:p>
@@ -10513,7 +10832,7 @@
           <w:sz w:val="20"/>
           <w:szCs w:val="20"/>
         </w:rPr>
-        <w:t xml:space="preserve">Objectif : vérifier la publication d'un événement, la liste d'attente et le pointage.</w:t>
+        <w:t xml:space="preserve">Objectif : vérifier que le cabinet voit ce qui l'attend sur le portail.</w:t>
       </w:r>
     </w:p>
     <w:p>
@@ -10527,7 +10846,7 @@
           <w:sz w:val="20"/>
           <w:szCs w:val="20"/>
         </w:rPr>
-        <w:t xml:space="preserve">Compte : test.consultant, puis test.porteur et porteur.demo.</w:t>
+        <w:t xml:space="preserve">Compte : test.consultant.</w:t>
       </w:r>
     </w:p>
     <w:p>
@@ -10541,7 +10860,7 @@
           <w:sz w:val="20"/>
           <w:szCs w:val="20"/>
         </w:rPr>
-        <w:t xml:space="preserve">Données : « Atelier plan d'affaires (essai) » ; une seule place.</w:t>
+        <w:t xml:space="preserve">Données : aucune.</w:t>
       </w:r>
     </w:p>
     <w:p>
@@ -10570,7 +10889,7 @@
           <w:sz w:val="20"/>
           <w:szCs w:val="20"/>
         </w:rPr>
-        <w:t xml:space="preserve">Onglet « Événements », « Nouvel événement » : intitulé, dates, lieu, « Places » 1. Enregistrez, puis publiez et confirmez.</w:t>
+        <w:t xml:space="preserve">Ouvrez Cabinet &gt; Portail des porteurs. Les onglets « Synthèse », « Messages », « Communications », « Ressources », « Événements », « Rendez-vous », « Porteurs et avis » s'affichent.</w:t>
       </w:r>
     </w:p>
     <w:p>
@@ -10599,36 +10918,7 @@
           <w:sz w:val="20"/>
           <w:szCs w:val="20"/>
         </w:rPr>
-        <w:t xml:space="preserve">test.porteur, puis porteur.demo : inscrivez-vous au portail.</w:t>
-      </w:r>
-    </w:p>
-    <w:p>
-      <w:pPr>
-        <w:tabs>
-          <w:tab w:val="left" w:pos="360"/>
-        </w:tabs>
-        <w:spacing w:after="60"/>
-        <w:ind w:left="360" w:hanging="360"/>
-        <w:jc w:val="both"/>
-      </w:pPr>
-      <w:r>
-        <w:rPr>
-          <w:rFonts w:ascii="Calibri" w:cs="Calibri" w:eastAsia="Calibri" w:hAnsi="Calibri"/>
-          <w:b/>
-          <w:bCs/>
-          <w:color w:val="1A9E9E"/>
-          <w:sz w:val="20"/>
-          <w:szCs w:val="20"/>
-        </w:rPr>
-        <w:t xml:space="preserve">3.	</w:t>
-      </w:r>
-      <w:r>
-        <w:rPr>
-          <w:rFonts w:ascii="Calibri" w:cs="Calibri" w:eastAsia="Calibri" w:hAnsi="Calibri"/>
-          <w:sz w:val="20"/>
-          <w:szCs w:val="20"/>
-        </w:rPr>
-        <w:t xml:space="preserve">test.consultant : ouvrez les « Inscrits », pointez « Présent » ou « Absent », puis « Exporter la liste (CSV) ».</w:t>
+        <w:t xml:space="preserve">Lisez la synthèse : porteurs actifs, messages en attente, rendez-vous demandés, comptes rendus à valider, inscriptions, satisfaction.</w:t>
       </w:r>
     </w:p>
     <w:p>
@@ -10642,7 +10932,7 @@
           <w:sz w:val="20"/>
           <w:szCs w:val="20"/>
         </w:rPr>
-        <w:t xml:space="preserve">Résultat attendu : le premier inscrit a la place, le second est en liste d'attente. La liste des inscrits se pointe et s'exporte.</w:t>
+        <w:t xml:space="preserve">Résultat attendu : chaque chiffre renvoie à l'onglet où agir ; la liste dit ce qui attend le cabinet.</w:t>
       </w:r>
     </w:p>
     <w:tbl>
@@ -10859,26 +11149,6 @@
     <w:p>
       <w:pPr>
         <w:keepNext/>
-        <w:pBdr>
-          <w:bottom w:val="single" w:color="1A9E9E" w:sz="6" w:space="2"/>
-        </w:pBdr>
-        <w:spacing w:after="100" w:before="280"/>
-      </w:pPr>
-      <w:r>
-        <w:rPr>
-          <w:rFonts w:ascii="Calibri" w:cs="Calibri" w:eastAsia="Calibri" w:hAnsi="Calibri"/>
-          <w:b/>
-          <w:bCs/>
-          <w:color w:val="1C1E6B"/>
-          <w:sz w:val="26"/>
-          <w:szCs w:val="26"/>
-        </w:rPr>
-        <w:t xml:space="preserve">D. Direction</w:t>
-      </w:r>
-    </w:p>
-    <w:p>
-      <w:pPr>
-        <w:keepNext/>
         <w:spacing w:after="100" w:before="200"/>
       </w:pPr>
       <w:r>
@@ -10890,7 +11160,7 @@
           <w:sz w:val="22"/>
           <w:szCs w:val="22"/>
         </w:rPr>
-        <w:t xml:space="preserve">AXP-25. Consulter un dossier sans le modifier</w:t>
+        <w:t xml:space="preserve">AXP-25. Répondre à un porteur depuis la messagerie du cabinet</w:t>
       </w:r>
     </w:p>
     <w:p>
@@ -10904,7 +11174,7 @@
           <w:sz w:val="20"/>
           <w:szCs w:val="20"/>
         </w:rPr>
-        <w:t xml:space="preserve">Objectif : vérifier que la direction suit le portefeuille et les dossiers en lecture seule.</w:t>
+        <w:t xml:space="preserve">Objectif : vérifier la messagerie de tous les dossiers et la note interne.</w:t>
       </w:r>
     </w:p>
     <w:p>
@@ -10918,7 +11188,7 @@
           <w:sz w:val="20"/>
           <w:szCs w:val="20"/>
         </w:rPr>
-        <w:t xml:space="preserve">Compte : test.dg.</w:t>
+        <w:t xml:space="preserve">Compte : test.consultant, puis test.porteur.</w:t>
       </w:r>
     </w:p>
     <w:p>
@@ -10932,7 +11202,7 @@
           <w:sz w:val="20"/>
           <w:szCs w:val="20"/>
         </w:rPr>
-        <w:t xml:space="preserve">Données : le dossier « Usine de briques compressées (démo) ».</w:t>
+        <w:t xml:space="preserve">Données : un message envoyé par test.porteur (POR-06).</w:t>
       </w:r>
     </w:p>
     <w:p>
@@ -10961,7 +11231,7 @@
           <w:sz w:val="20"/>
           <w:szCs w:val="20"/>
         </w:rPr>
-        <w:t xml:space="preserve">Ouvrez NIMOVA · MB AxisPro Consulting : lisez le portefeuille.</w:t>
+        <w:t xml:space="preserve">Onglet « Messages ». Choisissez « Non lues », puis la conversation de test.porteur.</w:t>
       </w:r>
     </w:p>
     <w:p>
@@ -10990,7 +11260,7 @@
           <w:sz w:val="20"/>
           <w:szCs w:val="20"/>
         </w:rPr>
-        <w:t xml:space="preserve">Ouvrez le dossier, onglet « Évaluation ».</w:t>
+        <w:t xml:space="preserve">Écrivez une réponse dans « Votre réponse au porteur… », envoyez (Ctrl + Entrée).</w:t>
       </w:r>
     </w:p>
     <w:p>
@@ -11019,7 +11289,36 @@
           <w:sz w:val="20"/>
           <w:szCs w:val="20"/>
         </w:rPr>
-        <w:t xml:space="preserve">Ouvrez Méthode &gt; Grille d'évaluation.</w:t>
+        <w:t xml:space="preserve">Cochez « Note interne », écrivez une note, puis « Enregistrer la note ».</w:t>
+      </w:r>
+    </w:p>
+    <w:p>
+      <w:pPr>
+        <w:tabs>
+          <w:tab w:val="left" w:pos="360"/>
+        </w:tabs>
+        <w:spacing w:after="60"/>
+        <w:ind w:left="360" w:hanging="360"/>
+        <w:jc w:val="both"/>
+      </w:pPr>
+      <w:r>
+        <w:rPr>
+          <w:rFonts w:ascii="Calibri" w:cs="Calibri" w:eastAsia="Calibri" w:hAnsi="Calibri"/>
+          <w:b/>
+          <w:bCs/>
+          <w:color w:val="1A9E9E"/>
+          <w:sz w:val="20"/>
+          <w:szCs w:val="20"/>
+        </w:rPr>
+        <w:t xml:space="preserve">4.	</w:t>
+      </w:r>
+      <w:r>
+        <w:rPr>
+          <w:rFonts w:ascii="Calibri" w:cs="Calibri" w:eastAsia="Calibri" w:hAnsi="Calibri"/>
+          <w:sz w:val="20"/>
+          <w:szCs w:val="20"/>
+        </w:rPr>
+        <w:t xml:space="preserve">test.porteur : lisez ses messages.</w:t>
       </w:r>
     </w:p>
     <w:p>
@@ -11033,7 +11332,7 @@
           <w:sz w:val="20"/>
           <w:szCs w:val="20"/>
         </w:rPr>
-        <w:t xml:space="preserve">Résultat attendu : le portefeuille et le dossier sont lisibles. L'évaluation affiche « Lecture seule : votre profil consulte l'évaluation. Seul le profil cabinet évalue les critères et joint les preuves. » ; la grille affiche « Lecture seule : votre profil consulte la grille. … ». Aucun bouton de saisie n'est proposé.</w:t>
+        <w:t xml:space="preserve">Résultat attendu : la conversation est signalée « En attente de réponse » avant la réponse. Le porteur lit la réponse, jamais la note interne.</w:t>
       </w:r>
     </w:p>
     <w:tbl>
@@ -11250,26 +11549,6 @@
     <w:p>
       <w:pPr>
         <w:keepNext/>
-        <w:pBdr>
-          <w:bottom w:val="single" w:color="1A9E9E" w:sz="6" w:space="2"/>
-        </w:pBdr>
-        <w:spacing w:after="100" w:before="280"/>
-      </w:pPr>
-      <w:r>
-        <w:rPr>
-          <w:rFonts w:ascii="Calibri" w:cs="Calibri" w:eastAsia="Calibri" w:hAnsi="Calibri"/>
-          <w:b/>
-          <w:bCs/>
-          <w:color w:val="1C1E6B"/>
-          <w:sz w:val="26"/>
-          <w:szCs w:val="26"/>
-        </w:rPr>
-        <w:t xml:space="preserve">E. Refus attendus</w:t>
-      </w:r>
-    </w:p>
-    <w:p>
-      <w:pPr>
-        <w:keepNext/>
         <w:spacing w:after="100" w:before="200"/>
       </w:pPr>
       <w:r>
@@ -11281,7 +11560,7 @@
           <w:sz w:val="22"/>
           <w:szCs w:val="22"/>
         </w:rPr>
-        <w:t xml:space="preserve">AXP-26. Un consultant seul ne scelle pas une décision</w:t>
+        <w:t xml:space="preserve">AXP-26. Publier une communication avec accusé de lecture</w:t>
       </w:r>
     </w:p>
     <w:p>
@@ -11295,7 +11574,7 @@
           <w:sz w:val="20"/>
           <w:szCs w:val="20"/>
         </w:rPr>
-        <w:t xml:space="preserve">Objectif : vérifier le principe des quatre yeux.</w:t>
+        <w:t xml:space="preserve">Objectif : vérifier la publication d'une communication à un public choisi et le suivi de sa lecture.</w:t>
       </w:r>
     </w:p>
     <w:p>
@@ -11309,7 +11588,7 @@
           <w:sz w:val="20"/>
           <w:szCs w:val="20"/>
         </w:rPr>
-        <w:t xml:space="preserve">Compte : test.consultant seul.</w:t>
+        <w:t xml:space="preserve">Compte : test.consultant, puis test.porteur.</w:t>
       </w:r>
     </w:p>
     <w:p>
@@ -11323,7 +11602,7 @@
           <w:sz w:val="20"/>
           <w:szCs w:val="20"/>
         </w:rPr>
-        <w:t xml:space="preserve">Données : un dossier ouvert et évalué par test.consultant seul ; décision GO.</w:t>
+        <w:t xml:space="preserve">Données : titre « Appel à projets agricole (essai) » ; public : le dossier « Unité de séchage de mangues (démo) » ; accusé de lecture demandé.</w:t>
       </w:r>
     </w:p>
     <w:p>
@@ -11352,7 +11631,94 @@
           <w:sz w:val="20"/>
           <w:szCs w:val="20"/>
         </w:rPr>
-        <w:t xml:space="preserve">Onglet « Comités », « Nouvelle revue de comité », décision GO, « Enregistrer, sceller et verrouiller », confirmez.</w:t>
+        <w:t xml:space="preserve">Onglet « Communications », « Nouvelle communication » : « Titre », « Nature », « Texte », le public et l'accusé de lecture. « Enregistrer le brouillon ».</w:t>
+      </w:r>
+    </w:p>
+    <w:p>
+      <w:pPr>
+        <w:tabs>
+          <w:tab w:val="left" w:pos="360"/>
+        </w:tabs>
+        <w:spacing w:after="60"/>
+        <w:ind w:left="360" w:hanging="360"/>
+        <w:jc w:val="both"/>
+      </w:pPr>
+      <w:r>
+        <w:rPr>
+          <w:rFonts w:ascii="Calibri" w:cs="Calibri" w:eastAsia="Calibri" w:hAnsi="Calibri"/>
+          <w:b/>
+          <w:bCs/>
+          <w:color w:val="1A9E9E"/>
+          <w:sz w:val="20"/>
+          <w:szCs w:val="20"/>
+        </w:rPr>
+        <w:t xml:space="preserve">2.	</w:t>
+      </w:r>
+      <w:r>
+        <w:rPr>
+          <w:rFonts w:ascii="Calibri" w:cs="Calibri" w:eastAsia="Calibri" w:hAnsi="Calibri"/>
+          <w:sz w:val="20"/>
+          <w:szCs w:val="20"/>
+        </w:rPr>
+        <w:t xml:space="preserve">Sur la communication, cliquez sur « Publier », lisez la fenêtre « Publier … ? », puis confirmez.</w:t>
+      </w:r>
+    </w:p>
+    <w:p>
+      <w:pPr>
+        <w:tabs>
+          <w:tab w:val="left" w:pos="360"/>
+        </w:tabs>
+        <w:spacing w:after="60"/>
+        <w:ind w:left="360" w:hanging="360"/>
+        <w:jc w:val="both"/>
+      </w:pPr>
+      <w:r>
+        <w:rPr>
+          <w:rFonts w:ascii="Calibri" w:cs="Calibri" w:eastAsia="Calibri" w:hAnsi="Calibri"/>
+          <w:b/>
+          <w:bCs/>
+          <w:color w:val="1A9E9E"/>
+          <w:sz w:val="20"/>
+          <w:szCs w:val="20"/>
+        </w:rPr>
+        <w:t xml:space="preserve">3.	</w:t>
+      </w:r>
+      <w:r>
+        <w:rPr>
+          <w:rFonts w:ascii="Calibri" w:cs="Calibri" w:eastAsia="Calibri" w:hAnsi="Calibri"/>
+          <w:sz w:val="20"/>
+          <w:szCs w:val="20"/>
+        </w:rPr>
+        <w:t xml:space="preserve">test.porteur : ouvrez « Actualités », lisez la communication, confirmez la lecture.</w:t>
+      </w:r>
+    </w:p>
+    <w:p>
+      <w:pPr>
+        <w:tabs>
+          <w:tab w:val="left" w:pos="360"/>
+        </w:tabs>
+        <w:spacing w:after="60"/>
+        <w:ind w:left="360" w:hanging="360"/>
+        <w:jc w:val="both"/>
+      </w:pPr>
+      <w:r>
+        <w:rPr>
+          <w:rFonts w:ascii="Calibri" w:cs="Calibri" w:eastAsia="Calibri" w:hAnsi="Calibri"/>
+          <w:b/>
+          <w:bCs/>
+          <w:color w:val="1A9E9E"/>
+          <w:sz w:val="20"/>
+          <w:szCs w:val="20"/>
+        </w:rPr>
+        <w:t xml:space="preserve">4.	</w:t>
+      </w:r>
+      <w:r>
+        <w:rPr>
+          <w:rFonts w:ascii="Calibri" w:cs="Calibri" w:eastAsia="Calibri" w:hAnsi="Calibri"/>
+          <w:sz w:val="20"/>
+          <w:szCs w:val="20"/>
+        </w:rPr>
+        <w:t xml:space="preserve">test.consultant : relisez la communication (« Lue », « Accusés »).</w:t>
       </w:r>
     </w:p>
     <w:p>
@@ -11366,7 +11732,7 @@
           <w:sz w:val="20"/>
           <w:szCs w:val="20"/>
         </w:rPr>
-        <w:t xml:space="preserve">Résultat attendu : le verrouillage est refusé : « Principe des quatre yeux : une décision du comité engage au moins deux personnes. Or vous êtes le seul auteur de la révision … : vous ne pouvez donc pas … seul. Un autre consultant du cabinet doit contribuer à cette révision ou s'en charger. ». Le dossier n'est pas figé. Le même refus s'applique à un passage de gate forcé.</w:t>
+        <w:t xml:space="preserve">Résultat attendu : « Communication publiée : les porteurs visés sont prévenus. ». Le porteur la voit avec une notification ; après sa confirmation, le cabinet voit l'accusé.</w:t>
       </w:r>
     </w:p>
     <w:tbl>
@@ -11594,7 +11960,7 @@
           <w:sz w:val="22"/>
           <w:szCs w:val="22"/>
         </w:rPr>
-        <w:t xml:space="preserve">AXP-27. Un compartiment confié à un autre ne s'évalue pas</w:t>
+        <w:t xml:space="preserve">AXP-27. Confirmer un rendez-vous demandé par un porteur</w:t>
       </w:r>
     </w:p>
     <w:p>
@@ -11608,7 +11974,7 @@
           <w:sz w:val="20"/>
           <w:szCs w:val="20"/>
         </w:rPr>
-        <w:t xml:space="preserve">Objectif : vérifier qu'un consultant n'évalue que ses compartiments, sauf le responsable du dossier.</w:t>
+        <w:t xml:space="preserve">Objectif : vérifier la réponse du cabinet à une demande de rendez-vous et le compte rendu partagé.</w:t>
       </w:r>
     </w:p>
     <w:p>
@@ -11622,7 +11988,7 @@
           <w:sz w:val="20"/>
           <w:szCs w:val="20"/>
         </w:rPr>
-        <w:t xml:space="preserve">Compte : l'associé, puis test.consultant.</w:t>
+        <w:t xml:space="preserve">Compte : test.consultant, puis test.porteur.</w:t>
       </w:r>
     </w:p>
     <w:p>
@@ -11636,7 +12002,7 @@
           <w:sz w:val="20"/>
           <w:szCs w:val="20"/>
         </w:rPr>
-        <w:t xml:space="preserve">Données : le dossier de AXP-16, dont le compartiment C3 est confié à test.consultant.</w:t>
+        <w:t xml:space="preserve">Données : une demande de rendez-vous de test.porteur (POR-09).</w:t>
       </w:r>
     </w:p>
     <w:p>
@@ -11665,7 +12031,7 @@
           <w:sz w:val="20"/>
           <w:szCs w:val="20"/>
         </w:rPr>
-        <w:t xml:space="preserve">test.consultant (responsable) : confiez C3 à lui-même dans « Suivi par compartiment ».</w:t>
+        <w:t xml:space="preserve">Onglet « Rendez-vous », bloc « À confirmer ou à décliner » : ouvrez la demande.</w:t>
       </w:r>
     </w:p>
     <w:p>
@@ -11694,7 +12060,36 @@
           <w:sz w:val="20"/>
           <w:szCs w:val="20"/>
         </w:rPr>
-        <w:t xml:space="preserve">L'associé : dans « Évaluation », « Grille complète », tentez de changer le statut d'un critère de C3.</w:t>
+        <w:t xml:space="preserve">Cliquez sur un des « Créneaux proposés par le porteur », renseignez le « Lieu », confirmez.</w:t>
+      </w:r>
+    </w:p>
+    <w:p>
+      <w:pPr>
+        <w:tabs>
+          <w:tab w:val="left" w:pos="360"/>
+        </w:tabs>
+        <w:spacing w:after="60"/>
+        <w:ind w:left="360" w:hanging="360"/>
+        <w:jc w:val="both"/>
+      </w:pPr>
+      <w:r>
+        <w:rPr>
+          <w:rFonts w:ascii="Calibri" w:cs="Calibri" w:eastAsia="Calibri" w:hAnsi="Calibri"/>
+          <w:b/>
+          <w:bCs/>
+          <w:color w:val="1A9E9E"/>
+          <w:sz w:val="20"/>
+          <w:szCs w:val="20"/>
+        </w:rPr>
+        <w:t xml:space="preserve">3.	</w:t>
+      </w:r>
+      <w:r>
+        <w:rPr>
+          <w:rFonts w:ascii="Calibri" w:cs="Calibri" w:eastAsia="Calibri" w:hAnsi="Calibri"/>
+          <w:sz w:val="20"/>
+          <w:szCs w:val="20"/>
+        </w:rPr>
+        <w:t xml:space="preserve">Le jour venu (ou sur un rendez-vous passé), « Marquer tenu » avec un compte rendu.</w:t>
       </w:r>
     </w:p>
     <w:p>
@@ -11708,7 +12103,7 @@
           <w:sz w:val="20"/>
           <w:szCs w:val="20"/>
         </w:rPr>
-        <w:t xml:space="preserve">Résultat attendu : le changement est refusé par un message qui indique que le compartiment C3 est confié à test.consultant et que seuls ce consultant et le responsable du dossier en écrivent l'évaluation ; le statut reste inchangé.</w:t>
+        <w:t xml:space="preserve">Résultat attendu : « Rendez-vous confirmé : le porteur est prévenu. » ; le rendez-vous passe dans « Confirmés à venir ». Marqué tenu, son compte rendu est lisible par le porteur.</w:t>
       </w:r>
     </w:p>
     <w:tbl>
@@ -11936,7 +12331,7 @@
           <w:sz w:val="22"/>
           <w:szCs w:val="22"/>
         </w:rPr>
-        <w:t xml:space="preserve">AXP-28. AxisPro fermé à la finance et au porteur</w:t>
+        <w:t xml:space="preserve">AXP-28. Publier un événement et gérer les inscriptions</w:t>
       </w:r>
     </w:p>
     <w:p>
@@ -11950,7 +12345,7 @@
           <w:sz w:val="20"/>
           <w:szCs w:val="20"/>
         </w:rPr>
-        <w:t xml:space="preserve">Objectif : vérifier que l'application du cabinet ne s'ouvre qu'aux profils prévus.</w:t>
+        <w:t xml:space="preserve">Objectif : vérifier la publication d'un événement, la liste d'attente et le pointage.</w:t>
       </w:r>
     </w:p>
     <w:p>
@@ -11964,7 +12359,7 @@
           <w:sz w:val="20"/>
           <w:szCs w:val="20"/>
         </w:rPr>
-        <w:t xml:space="preserve">Compte : test.daf, puis test.porteur.</w:t>
+        <w:t xml:space="preserve">Compte : test.consultant, puis test.porteur et porteur.demo.</w:t>
       </w:r>
     </w:p>
     <w:p>
@@ -11978,7 +12373,7 @@
           <w:sz w:val="20"/>
           <w:szCs w:val="20"/>
         </w:rPr>
-        <w:t xml:space="preserve">Données : aucune.</w:t>
+        <w:t xml:space="preserve">Données : « Atelier plan d'affaires (essai) » ; une seule place.</w:t>
       </w:r>
     </w:p>
     <w:p>
@@ -12007,7 +12402,7 @@
           <w:sz w:val="20"/>
           <w:szCs w:val="20"/>
         </w:rPr>
-        <w:t xml:space="preserve">test.daf : l'accueil ne montre pas de rayon MB AxisPro Consulting. Dans la barre d'adresse, remplacez la fin de l'adresse par /axispro.</w:t>
+        <w:t xml:space="preserve">Onglet « Événements », « Nouvel événement » : intitulé, dates, lieu, « Places » 1. Enregistrez, puis publiez et confirmez.</w:t>
       </w:r>
     </w:p>
     <w:p>
@@ -12036,7 +12431,36 @@
           <w:sz w:val="20"/>
           <w:szCs w:val="20"/>
         </w:rPr>
-        <w:t xml:space="preserve">test.porteur : faites de même depuis le portail.</w:t>
+        <w:t xml:space="preserve">test.porteur, puis porteur.demo : inscrivez-vous au portail.</w:t>
+      </w:r>
+    </w:p>
+    <w:p>
+      <w:pPr>
+        <w:tabs>
+          <w:tab w:val="left" w:pos="360"/>
+        </w:tabs>
+        <w:spacing w:after="60"/>
+        <w:ind w:left="360" w:hanging="360"/>
+        <w:jc w:val="both"/>
+      </w:pPr>
+      <w:r>
+        <w:rPr>
+          <w:rFonts w:ascii="Calibri" w:cs="Calibri" w:eastAsia="Calibri" w:hAnsi="Calibri"/>
+          <w:b/>
+          <w:bCs/>
+          <w:color w:val="1A9E9E"/>
+          <w:sz w:val="20"/>
+          <w:szCs w:val="20"/>
+        </w:rPr>
+        <w:t xml:space="preserve">3.	</w:t>
+      </w:r>
+      <w:r>
+        <w:rPr>
+          <w:rFonts w:ascii="Calibri" w:cs="Calibri" w:eastAsia="Calibri" w:hAnsi="Calibri"/>
+          <w:sz w:val="20"/>
+          <w:szCs w:val="20"/>
+        </w:rPr>
+        <w:t xml:space="preserve">test.consultant : ouvrez les « Inscrits », pointez « Présent » ou « Absent », puis « Exporter la liste (CSV) ».</w:t>
       </w:r>
     </w:p>
     <w:p>
@@ -12050,7 +12474,7 @@
           <w:sz w:val="20"/>
           <w:szCs w:val="20"/>
         </w:rPr>
-        <w:t xml:space="preserve">Résultat attendu : dans les deux cas, la page « Accès non ouvert à votre profil » s'affiche, sans aucune donnée des dossiers.</w:t>
+        <w:t xml:space="preserve">Résultat attendu : le premier inscrit a la place, le second est en liste d'attente. La liste des inscrits se pointe et s'exporte.</w:t>
       </w:r>
     </w:p>
     <w:tbl>
@@ -12267,6 +12691,26 @@
     <w:p>
       <w:pPr>
         <w:keepNext/>
+        <w:pBdr>
+          <w:bottom w:val="single" w:color="1A9E9E" w:sz="6" w:space="2"/>
+        </w:pBdr>
+        <w:spacing w:after="100" w:before="280"/>
+      </w:pPr>
+      <w:r>
+        <w:rPr>
+          <w:rFonts w:ascii="Calibri" w:cs="Calibri" w:eastAsia="Calibri" w:hAnsi="Calibri"/>
+          <w:b/>
+          <w:bCs/>
+          <w:color w:val="1C1E6B"/>
+          <w:sz w:val="26"/>
+          <w:szCs w:val="26"/>
+        </w:rPr>
+        <w:t xml:space="preserve">D. Direction</w:t>
+      </w:r>
+    </w:p>
+    <w:p>
+      <w:pPr>
+        <w:keepNext/>
         <w:spacing w:after="100" w:before="200"/>
       </w:pPr>
       <w:r>
@@ -12278,7 +12722,7 @@
           <w:sz w:val="22"/>
           <w:szCs w:val="22"/>
         </w:rPr>
-        <w:t xml:space="preserve">AXP-29. Formats de fichiers refusés dans la data room</w:t>
+        <w:t xml:space="preserve">AXP-29. Consulter un dossier sans le modifier</w:t>
       </w:r>
     </w:p>
     <w:p>
@@ -12292,7 +12736,7 @@
           <w:sz w:val="20"/>
           <w:szCs w:val="20"/>
         </w:rPr>
-        <w:t xml:space="preserve">Objectif : vérifier que seuls les formats sûrs entrent dans la data room.</w:t>
+        <w:t xml:space="preserve">Objectif : vérifier que la direction suit le portefeuille et les dossiers en lecture seule.</w:t>
       </w:r>
     </w:p>
     <w:p>
@@ -12306,7 +12750,7 @@
           <w:sz w:val="20"/>
           <w:szCs w:val="20"/>
         </w:rPr>
-        <w:t xml:space="preserve">Compte : test.consultant.</w:t>
+        <w:t xml:space="preserve">Compte : test.dg.</w:t>
       </w:r>
     </w:p>
     <w:p>
@@ -12320,7 +12764,7 @@
           <w:sz w:val="20"/>
           <w:szCs w:val="20"/>
         </w:rPr>
-        <w:t xml:space="preserve">Données : une archive .zip ; un ancien document Word .doc ; un document Word à macros (.docm).</w:t>
+        <w:t xml:space="preserve">Données : le dossier « Usine de briques compressées (démo) ».</w:t>
       </w:r>
     </w:p>
     <w:p>
@@ -12349,7 +12793,7 @@
           <w:sz w:val="20"/>
           <w:szCs w:val="20"/>
         </w:rPr>
-        <w:t xml:space="preserve">Onglet « Data room », « Déposer » sur une pièce : choisissez l'archive (affichez « Tous les fichiers » dans la fenêtre de choix).</w:t>
+        <w:t xml:space="preserve">Ouvrez NIMOVA · MB AxisPro Consulting : lisez le portefeuille.</w:t>
       </w:r>
     </w:p>
     <w:p>
@@ -12378,7 +12822,36 @@
           <w:sz w:val="20"/>
           <w:szCs w:val="20"/>
         </w:rPr>
-        <w:t xml:space="preserve">Recommencez avec le .doc, puis le .docm.</w:t>
+        <w:t xml:space="preserve">Ouvrez le dossier, onglets « Synthèse » et « Évaluation ».</w:t>
+      </w:r>
+    </w:p>
+    <w:p>
+      <w:pPr>
+        <w:tabs>
+          <w:tab w:val="left" w:pos="360"/>
+        </w:tabs>
+        <w:spacing w:after="60"/>
+        <w:ind w:left="360" w:hanging="360"/>
+        <w:jc w:val="both"/>
+      </w:pPr>
+      <w:r>
+        <w:rPr>
+          <w:rFonts w:ascii="Calibri" w:cs="Calibri" w:eastAsia="Calibri" w:hAnsi="Calibri"/>
+          <w:b/>
+          <w:bCs/>
+          <w:color w:val="1A9E9E"/>
+          <w:sz w:val="20"/>
+          <w:szCs w:val="20"/>
+        </w:rPr>
+        <w:t xml:space="preserve">3.	</w:t>
+      </w:r>
+      <w:r>
+        <w:rPr>
+          <w:rFonts w:ascii="Calibri" w:cs="Calibri" w:eastAsia="Calibri" w:hAnsi="Calibri"/>
+          <w:sz w:val="20"/>
+          <w:szCs w:val="20"/>
+        </w:rPr>
+        <w:t xml:space="preserve">Ouvrez Méthode &gt; Grille d'évaluation.</w:t>
       </w:r>
     </w:p>
     <w:p>
@@ -12392,7 +12865,7 @@
           <w:sz w:val="20"/>
           <w:szCs w:val="20"/>
         </w:rPr>
-        <w:t xml:space="preserve">Résultat attendu : chaque dépôt est refusé par un message qui rappelle les formats acceptés : PDF, JPEG, PNG, Word (.docx) ou Excel (.xlsx). Aucune pièce n'est ajoutée.</w:t>
+        <w:t xml:space="preserve">Résultat attendu : le portefeuille et le dossier sont lisibles. L'évaluation affiche « Lecture seule : votre profil consulte l'évaluation. Seul le profil cabinet évalue les critères et joint les preuves. » ; la grille affiche « Lecture seule : votre profil consulte la grille. … ». Ni « Ouvrir l'accès », ni « Confier le dossier », ni « Suspendre » ne sont proposés.</w:t>
       </w:r>
     </w:p>
     <w:tbl>
@@ -12623,7 +13096,7 @@
           <w:sz w:val="26"/>
           <w:szCs w:val="26"/>
         </w:rPr>
-        <w:t xml:space="preserve">F. Contrôles de saisie et de sécurité</w:t>
+        <w:t xml:space="preserve">E. Refus attendus</w:t>
       </w:r>
     </w:p>
     <w:p>
@@ -12640,7 +13113,7 @@
           <w:sz w:val="22"/>
           <w:szCs w:val="22"/>
         </w:rPr>
-        <w:t xml:space="preserve">AXP-30. Nombres écrits à la française</w:t>
+        <w:t xml:space="preserve">AXP-30. Un consultant seul ne scelle pas une décision</w:t>
       </w:r>
     </w:p>
     <w:p>
@@ -12654,7 +13127,7 @@
           <w:sz w:val="20"/>
           <w:szCs w:val="20"/>
         </w:rPr>
-        <w:t xml:space="preserve">Objectif : vérifier que les montants et les heures s'écrivent à la française et qu'une écriture ambiguë est refusée avec un message, sans être mal lue.</w:t>
+        <w:t xml:space="preserve">Objectif : vérifier le principe des quatre yeux.</w:t>
       </w:r>
     </w:p>
     <w:p>
@@ -12668,7 +13141,7 @@
           <w:sz w:val="20"/>
           <w:szCs w:val="20"/>
         </w:rPr>
-        <w:t xml:space="preserve">Compte : test.consultant.</w:t>
+        <w:t xml:space="preserve">Compte : test.consultant seul.</w:t>
       </w:r>
     </w:p>
     <w:p>
@@ -12682,7 +13155,7 @@
           <w:sz w:val="20"/>
           <w:szCs w:val="20"/>
         </w:rPr>
-        <w:t xml:space="preserve">Données : modèle financier : prix « 12 500 » puis « 12.500 » puis « 2.500.000 » ; temps : « 1,5 » heure.</w:t>
+        <w:t xml:space="preserve">Données : un dossier ouvert pour l'essai (par exemple celui de AXP-17, repris), dont test.consultant a évalué au moins un critère et que personne d'autre n'a touché ; décision GO.</w:t>
       </w:r>
     </w:p>
     <w:p>
@@ -12711,94 +13184,7 @@
           <w:sz w:val="20"/>
           <w:szCs w:val="20"/>
         </w:rPr>
-        <w:t xml:space="preserve">Modèle financier, case « Prix unitaire » d'un produit : saisissez « 12 500 », cliquez ailleurs.</w:t>
-      </w:r>
-    </w:p>
-    <w:p>
-      <w:pPr>
-        <w:tabs>
-          <w:tab w:val="left" w:pos="360"/>
-        </w:tabs>
-        <w:spacing w:after="60"/>
-        <w:ind w:left="360" w:hanging="360"/>
-        <w:jc w:val="both"/>
-      </w:pPr>
-      <w:r>
-        <w:rPr>
-          <w:rFonts w:ascii="Calibri" w:cs="Calibri" w:eastAsia="Calibri" w:hAnsi="Calibri"/>
-          <w:b/>
-          <w:bCs/>
-          <w:color w:val="1A9E9E"/>
-          <w:sz w:val="20"/>
-          <w:szCs w:val="20"/>
-        </w:rPr>
-        <w:t xml:space="preserve">2.	</w:t>
-      </w:r>
-      <w:r>
-        <w:rPr>
-          <w:rFonts w:ascii="Calibri" w:cs="Calibri" w:eastAsia="Calibri" w:hAnsi="Calibri"/>
-          <w:sz w:val="20"/>
-          <w:szCs w:val="20"/>
-        </w:rPr>
-        <w:t xml:space="preserve">Saisissez « 12.500 », cliquez ailleurs.</w:t>
-      </w:r>
-    </w:p>
-    <w:p>
-      <w:pPr>
-        <w:tabs>
-          <w:tab w:val="left" w:pos="360"/>
-        </w:tabs>
-        <w:spacing w:after="60"/>
-        <w:ind w:left="360" w:hanging="360"/>
-        <w:jc w:val="both"/>
-      </w:pPr>
-      <w:r>
-        <w:rPr>
-          <w:rFonts w:ascii="Calibri" w:cs="Calibri" w:eastAsia="Calibri" w:hAnsi="Calibri"/>
-          <w:b/>
-          <w:bCs/>
-          <w:color w:val="1A9E9E"/>
-          <w:sz w:val="20"/>
-          <w:szCs w:val="20"/>
-        </w:rPr>
-        <w:t xml:space="preserve">3.	</w:t>
-      </w:r>
-      <w:r>
-        <w:rPr>
-          <w:rFonts w:ascii="Calibri" w:cs="Calibri" w:eastAsia="Calibri" w:hAnsi="Calibri"/>
-          <w:sz w:val="20"/>
-          <w:szCs w:val="20"/>
-        </w:rPr>
-        <w:t xml:space="preserve">Saisissez « 2.500.000 », cliquez ailleurs.</w:t>
-      </w:r>
-    </w:p>
-    <w:p>
-      <w:pPr>
-        <w:tabs>
-          <w:tab w:val="left" w:pos="360"/>
-        </w:tabs>
-        <w:spacing w:after="60"/>
-        <w:ind w:left="360" w:hanging="360"/>
-        <w:jc w:val="both"/>
-      </w:pPr>
-      <w:r>
-        <w:rPr>
-          <w:rFonts w:ascii="Calibri" w:cs="Calibri" w:eastAsia="Calibri" w:hAnsi="Calibri"/>
-          <w:b/>
-          <w:bCs/>
-          <w:color w:val="1A9E9E"/>
-          <w:sz w:val="20"/>
-          <w:szCs w:val="20"/>
-        </w:rPr>
-        <w:t xml:space="preserve">4.	</w:t>
-      </w:r>
-      <w:r>
-        <w:rPr>
-          <w:rFonts w:ascii="Calibri" w:cs="Calibri" w:eastAsia="Calibri" w:hAnsi="Calibri"/>
-          <w:sz w:val="20"/>
-          <w:szCs w:val="20"/>
-        </w:rPr>
-        <w:t xml:space="preserve">Onglet « Temps », « Saisir du temps » : « Heures » « 1,5 », enregistrez.</w:t>
+        <w:t xml:space="preserve">Onglet « Comités », « Nouvelle revue de comité », décision GO, « Enregistrer, sceller et verrouiller », puis « Sceller et verrouiller ».</w:t>
       </w:r>
     </w:p>
     <w:p>
@@ -12812,7 +13198,7 @@
           <w:sz w:val="20"/>
           <w:szCs w:val="20"/>
         </w:rPr>
-        <w:t xml:space="preserve">Résultat attendu : « 12 500 » est enregistré tel quel. « 12.500 » et « 2.500.000 » sont refusés par le message « Nombre illisible : écrivez par exemple 750 000 ou 2,5. » : la valeur n'est ni lue 12,5 ni enregistrée. « 1,5 » heure est accepté.</w:t>
+        <w:t xml:space="preserve">Résultat attendu : le verrouillage est refusé : « Principe des quatre yeux : une décision du comité engage au moins deux personnes. Or vous êtes le seul auteur de la révision … : vous ne pouvez donc pas … seul. Un autre consultant du cabinet doit contribuer à cette révision ou s'en charger. ». Le dossier n'est pas figé. Le même refus s'applique à un passage de gate forcé.</w:t>
       </w:r>
     </w:p>
     <w:tbl>
@@ -13040,7 +13426,7 @@
           <w:sz w:val="22"/>
           <w:szCs w:val="22"/>
         </w:rPr>
-        <w:t xml:space="preserve">AXP-31. Un double clic ne franchit qu'un gate et ne crée qu'une facture</w:t>
+        <w:t xml:space="preserve">AXP-31. Un compartiment confié à un autre ne s'évalue pas</w:t>
       </w:r>
     </w:p>
     <w:p>
@@ -13054,7 +13440,7 @@
           <w:sz w:val="20"/>
           <w:szCs w:val="20"/>
         </w:rPr>
-        <w:t xml:space="preserve">Objectif : vérifier qu'un double clic n'enregistre qu'une fois.</w:t>
+        <w:t xml:space="preserve">Objectif : vérifier qu'un consultant n'évalue que ses compartiments, sauf le responsable du dossier.</w:t>
       </w:r>
     </w:p>
     <w:p>
@@ -13068,7 +13454,7 @@
           <w:sz w:val="20"/>
           <w:szCs w:val="20"/>
         </w:rPr>
-        <w:t xml:space="preserve">Compte : test.consultant.</w:t>
+        <w:t xml:space="preserve">Compte : test.consultant (responsable), puis test.associe.</w:t>
       </w:r>
     </w:p>
     <w:p>
@@ -13082,7 +13468,7 @@
           <w:sz w:val="20"/>
           <w:szCs w:val="20"/>
         </w:rPr>
-        <w:t xml:space="preserve">Données : un dossier dont le gate en cours permet le passage ; des temps à facturer.</w:t>
+        <w:t xml:space="preserve">Données : le dossier de AXP-18 ; compartiment C3 confié à test.consultant.</w:t>
       </w:r>
     </w:p>
     <w:p>
@@ -13111,7 +13497,7 @@
           <w:sz w:val="20"/>
           <w:szCs w:val="20"/>
         </w:rPr>
-        <w:t xml:space="preserve">Onglet « Stage gates » : double-cliquez sur « Passer au gate suivant ».</w:t>
+        <w:t xml:space="preserve">test.consultant : dans « Suivi par compartiment », confiez C3 à « Test - Consultant du cabinet ».</w:t>
       </w:r>
     </w:p>
     <w:p>
@@ -13140,7 +13526,7 @@
           <w:sz w:val="20"/>
           <w:szCs w:val="20"/>
         </w:rPr>
-        <w:t xml:space="preserve">Onglet « Temps » : double-cliquez sur « Créer la facture ».</w:t>
+        <w:t xml:space="preserve">test.associe : dans « Évaluation », « Grille complète », repérez un critère de C3.</w:t>
       </w:r>
     </w:p>
     <w:p>
@@ -13154,7 +13540,7 @@
           <w:sz w:val="20"/>
           <w:szCs w:val="20"/>
         </w:rPr>
-        <w:t xml:space="preserve">Résultat attendu : le dossier ne franchit qu'un seul gate ; une seule facture d'honoraires est créée.</w:t>
+        <w:t xml:space="preserve">Résultat attendu : chez test.associe, les boutons de statut des critères de C3 sont grisés et la ligne indique « Compartiment confié à Test - Consultant du cabinet » ; seuls ce consultant et le responsable du dossier les évaluent.</w:t>
       </w:r>
     </w:p>
     <w:tbl>
@@ -13382,7 +13768,1453 @@
           <w:sz w:val="22"/>
           <w:szCs w:val="22"/>
         </w:rPr>
-        <w:t xml:space="preserve">AXP-32. Confirmation avant une action irréversible</w:t>
+        <w:t xml:space="preserve">AXP-32. AxisPro fermé à la finance et au porteur</w:t>
+      </w:r>
+    </w:p>
+    <w:p>
+      <w:pPr>
+        <w:spacing w:after="100"/>
+        <w:jc w:val="both"/>
+      </w:pPr>
+      <w:r>
+        <w:rPr>
+          <w:rFonts w:ascii="Calibri" w:cs="Calibri" w:eastAsia="Calibri" w:hAnsi="Calibri"/>
+          <w:sz w:val="20"/>
+          <w:szCs w:val="20"/>
+        </w:rPr>
+        <w:t xml:space="preserve">Objectif : vérifier que l'application du cabinet ne s'ouvre qu'aux profils prévus.</w:t>
+      </w:r>
+    </w:p>
+    <w:p>
+      <w:pPr>
+        <w:spacing w:after="100"/>
+        <w:jc w:val="both"/>
+      </w:pPr>
+      <w:r>
+        <w:rPr>
+          <w:rFonts w:ascii="Calibri" w:cs="Calibri" w:eastAsia="Calibri" w:hAnsi="Calibri"/>
+          <w:sz w:val="20"/>
+          <w:szCs w:val="20"/>
+        </w:rPr>
+        <w:t xml:space="preserve">Compte : test.daf, puis test.porteur.</w:t>
+      </w:r>
+    </w:p>
+    <w:p>
+      <w:pPr>
+        <w:spacing w:after="100"/>
+        <w:jc w:val="both"/>
+      </w:pPr>
+      <w:r>
+        <w:rPr>
+          <w:rFonts w:ascii="Calibri" w:cs="Calibri" w:eastAsia="Calibri" w:hAnsi="Calibri"/>
+          <w:sz w:val="20"/>
+          <w:szCs w:val="20"/>
+        </w:rPr>
+        <w:t xml:space="preserve">Données : aucune.</w:t>
+      </w:r>
+    </w:p>
+    <w:p>
+      <w:pPr>
+        <w:tabs>
+          <w:tab w:val="left" w:pos="360"/>
+        </w:tabs>
+        <w:spacing w:after="60"/>
+        <w:ind w:left="360" w:hanging="360"/>
+        <w:jc w:val="both"/>
+      </w:pPr>
+      <w:r>
+        <w:rPr>
+          <w:rFonts w:ascii="Calibri" w:cs="Calibri" w:eastAsia="Calibri" w:hAnsi="Calibri"/>
+          <w:b/>
+          <w:bCs/>
+          <w:color w:val="1A9E9E"/>
+          <w:sz w:val="20"/>
+          <w:szCs w:val="20"/>
+        </w:rPr>
+        <w:t xml:space="preserve">1.	</w:t>
+      </w:r>
+      <w:r>
+        <w:rPr>
+          <w:rFonts w:ascii="Calibri" w:cs="Calibri" w:eastAsia="Calibri" w:hAnsi="Calibri"/>
+          <w:sz w:val="20"/>
+          <w:szCs w:val="20"/>
+        </w:rPr>
+        <w:t xml:space="preserve">test.daf : l'accueil ne montre pas de rayon MB AxisPro Consulting. Dans la barre d'adresse, remplacez la fin de l'adresse par /axispro.</w:t>
+      </w:r>
+    </w:p>
+    <w:p>
+      <w:pPr>
+        <w:tabs>
+          <w:tab w:val="left" w:pos="360"/>
+        </w:tabs>
+        <w:spacing w:after="60"/>
+        <w:ind w:left="360" w:hanging="360"/>
+        <w:jc w:val="both"/>
+      </w:pPr>
+      <w:r>
+        <w:rPr>
+          <w:rFonts w:ascii="Calibri" w:cs="Calibri" w:eastAsia="Calibri" w:hAnsi="Calibri"/>
+          <w:b/>
+          <w:bCs/>
+          <w:color w:val="1A9E9E"/>
+          <w:sz w:val="20"/>
+          <w:szCs w:val="20"/>
+        </w:rPr>
+        <w:t xml:space="preserve">2.	</w:t>
+      </w:r>
+      <w:r>
+        <w:rPr>
+          <w:rFonts w:ascii="Calibri" w:cs="Calibri" w:eastAsia="Calibri" w:hAnsi="Calibri"/>
+          <w:sz w:val="20"/>
+          <w:szCs w:val="20"/>
+        </w:rPr>
+        <w:t xml:space="preserve">test.porteur : faites de même depuis le portail.</w:t>
+      </w:r>
+    </w:p>
+    <w:p>
+      <w:pPr>
+        <w:spacing w:after="100"/>
+        <w:jc w:val="both"/>
+      </w:pPr>
+      <w:r>
+        <w:rPr>
+          <w:rFonts w:ascii="Calibri" w:cs="Calibri" w:eastAsia="Calibri" w:hAnsi="Calibri"/>
+          <w:sz w:val="20"/>
+          <w:szCs w:val="20"/>
+        </w:rPr>
+        <w:t xml:space="preserve">Résultat attendu : dans les deux cas, la page « Accès non ouvert à votre profil » s'affiche, sans aucune donnée des dossiers.</w:t>
+      </w:r>
+    </w:p>
+    <w:tbl>
+      <w:tblPr>
+        <w:tblW w:type="dxa" w:w="9638"/>
+        <w:tblBorders>
+          <w:top w:val="single" w:color="auto" w:sz="4"/>
+          <w:left w:val="single" w:color="auto" w:sz="4"/>
+          <w:bottom w:val="single" w:color="auto" w:sz="4"/>
+          <w:right w:val="single" w:color="auto" w:sz="4"/>
+          <w:insideH w:val="single" w:color="auto" w:sz="4"/>
+          <w:insideV w:val="single" w:color="auto" w:sz="4"/>
+        </w:tblBorders>
+      </w:tblPr>
+      <w:tblGrid>
+        <w:gridCol w:w="2586"/>
+        <w:gridCol w:w="7052"/>
+      </w:tblGrid>
+      <w:tr>
+        <w:trPr>
+          <w:tblHeader/>
+        </w:trPr>
+        <w:tc>
+          <w:tcPr>
+            <w:tcW w:type="dxa" w:w="2586"/>
+            <w:tcBorders>
+              <w:top w:val="single" w:color="C9CFD8" w:sz="4"/>
+              <w:left w:val="single" w:color="C9CFD8" w:sz="4"/>
+              <w:bottom w:val="single" w:color="C9CFD8" w:sz="4"/>
+              <w:right w:val="single" w:color="C9CFD8" w:sz="4"/>
+            </w:tcBorders>
+            <w:shd w:fill="1C1E6B" w:color="auto" w:val="clear"/>
+            <w:tcMar>
+              <w:top w:type="dxa" w:w="50"/>
+              <w:left w:type="dxa" w:w="90"/>
+              <w:bottom w:type="dxa" w:w="50"/>
+              <w:right w:type="dxa" w:w="90"/>
+            </w:tcMar>
+            <w:vAlign w:val="center"/>
+          </w:tcPr>
+          <w:p>
+            <w:pPr>
+              <w:spacing w:after="0"/>
+            </w:pPr>
+            <w:r>
+              <w:rPr>
+                <w:rFonts w:ascii="Calibri" w:cs="Calibri" w:eastAsia="Calibri" w:hAnsi="Calibri"/>
+                <w:b/>
+                <w:bCs/>
+                <w:color w:val="FFFFFF"/>
+                <w:sz w:val="17"/>
+                <w:szCs w:val="17"/>
+              </w:rPr>
+              <w:t xml:space="preserve">Résultat</w:t>
+            </w:r>
+          </w:p>
+        </w:tc>
+        <w:tc>
+          <w:tcPr>
+            <w:tcW w:type="dxa" w:w="7052"/>
+            <w:tcBorders>
+              <w:top w:val="single" w:color="C9CFD8" w:sz="4"/>
+              <w:left w:val="single" w:color="C9CFD8" w:sz="4"/>
+              <w:bottom w:val="single" w:color="C9CFD8" w:sz="4"/>
+              <w:right w:val="single" w:color="C9CFD8" w:sz="4"/>
+            </w:tcBorders>
+            <w:shd w:fill="1C1E6B" w:color="auto" w:val="clear"/>
+            <w:tcMar>
+              <w:top w:type="dxa" w:w="50"/>
+              <w:left w:type="dxa" w:w="90"/>
+              <w:bottom w:type="dxa" w:w="50"/>
+              <w:right w:type="dxa" w:w="90"/>
+            </w:tcMar>
+            <w:vAlign w:val="center"/>
+          </w:tcPr>
+          <w:p>
+            <w:pPr>
+              <w:spacing w:after="0"/>
+            </w:pPr>
+            <w:r>
+              <w:rPr>
+                <w:rFonts w:ascii="Calibri" w:cs="Calibri" w:eastAsia="Calibri" w:hAnsi="Calibri"/>
+                <w:b/>
+                <w:bCs/>
+                <w:color w:val="FFFFFF"/>
+                <w:sz w:val="17"/>
+                <w:szCs w:val="17"/>
+              </w:rPr>
+              <w:t xml:space="preserve">Remarques</w:t>
+            </w:r>
+          </w:p>
+        </w:tc>
+      </w:tr>
+      <w:tr>
+        <w:tc>
+          <w:tcPr>
+            <w:tcW w:type="dxa" w:w="2586"/>
+            <w:tcBorders>
+              <w:top w:val="single" w:color="C9CFD8" w:sz="4"/>
+              <w:left w:val="single" w:color="C9CFD8" w:sz="4"/>
+              <w:bottom w:val="single" w:color="C9CFD8" w:sz="4"/>
+              <w:right w:val="single" w:color="C9CFD8" w:sz="4"/>
+            </w:tcBorders>
+            <w:tcMar>
+              <w:top w:type="dxa" w:w="50"/>
+              <w:left w:type="dxa" w:w="90"/>
+              <w:bottom w:type="dxa" w:w="50"/>
+              <w:right w:type="dxa" w:w="90"/>
+            </w:tcMar>
+            <w:vAlign w:val="center"/>
+          </w:tcPr>
+          <w:p>
+            <w:pPr>
+              <w:spacing w:after="0"/>
+            </w:pPr>
+            <w:r>
+              <w:rPr>
+                <w:rFonts w:ascii="Calibri" w:cs="Calibri" w:eastAsia="Calibri" w:hAnsi="Calibri"/>
+                <w:sz w:val="17"/>
+                <w:szCs w:val="17"/>
+              </w:rPr>
+              <w:t xml:space="preserve">☐ Réussi</w:t>
+            </w:r>
+          </w:p>
+        </w:tc>
+        <w:tc>
+          <w:tcPr>
+            <w:tcW w:type="dxa" w:w="7052"/>
+            <w:tcBorders>
+              <w:top w:val="single" w:color="C9CFD8" w:sz="4"/>
+              <w:left w:val="single" w:color="C9CFD8" w:sz="4"/>
+              <w:bottom w:val="single" w:color="C9CFD8" w:sz="4"/>
+              <w:right w:val="single" w:color="C9CFD8" w:sz="4"/>
+            </w:tcBorders>
+            <w:tcMar>
+              <w:top w:type="dxa" w:w="50"/>
+              <w:left w:type="dxa" w:w="90"/>
+              <w:bottom w:type="dxa" w:w="50"/>
+              <w:right w:type="dxa" w:w="90"/>
+            </w:tcMar>
+            <w:vAlign w:val="center"/>
+          </w:tcPr>
+          <w:p>
+            <w:pPr>
+              <w:spacing w:after="0"/>
+            </w:pPr>
+          </w:p>
+        </w:tc>
+      </w:tr>
+      <w:tr>
+        <w:tc>
+          <w:tcPr>
+            <w:tcW w:type="dxa" w:w="2586"/>
+            <w:tcBorders>
+              <w:top w:val="single" w:color="C9CFD8" w:sz="4"/>
+              <w:left w:val="single" w:color="C9CFD8" w:sz="4"/>
+              <w:bottom w:val="single" w:color="C9CFD8" w:sz="4"/>
+              <w:right w:val="single" w:color="C9CFD8" w:sz="4"/>
+            </w:tcBorders>
+            <w:shd w:fill="F2F4F7" w:color="auto" w:val="clear"/>
+            <w:tcMar>
+              <w:top w:type="dxa" w:w="50"/>
+              <w:left w:type="dxa" w:w="90"/>
+              <w:bottom w:type="dxa" w:w="50"/>
+              <w:right w:type="dxa" w:w="90"/>
+            </w:tcMar>
+            <w:vAlign w:val="center"/>
+          </w:tcPr>
+          <w:p>
+            <w:pPr>
+              <w:spacing w:after="0"/>
+            </w:pPr>
+            <w:r>
+              <w:rPr>
+                <w:rFonts w:ascii="Calibri" w:cs="Calibri" w:eastAsia="Calibri" w:hAnsi="Calibri"/>
+                <w:sz w:val="17"/>
+                <w:szCs w:val="17"/>
+              </w:rPr>
+              <w:t xml:space="preserve">☐ Échoué</w:t>
+            </w:r>
+          </w:p>
+        </w:tc>
+        <w:tc>
+          <w:tcPr>
+            <w:tcW w:type="dxa" w:w="7052"/>
+            <w:tcBorders>
+              <w:top w:val="single" w:color="C9CFD8" w:sz="4"/>
+              <w:left w:val="single" w:color="C9CFD8" w:sz="4"/>
+              <w:bottom w:val="single" w:color="C9CFD8" w:sz="4"/>
+              <w:right w:val="single" w:color="C9CFD8" w:sz="4"/>
+            </w:tcBorders>
+            <w:shd w:fill="F2F4F7" w:color="auto" w:val="clear"/>
+            <w:tcMar>
+              <w:top w:type="dxa" w:w="50"/>
+              <w:left w:type="dxa" w:w="90"/>
+              <w:bottom w:type="dxa" w:w="50"/>
+              <w:right w:type="dxa" w:w="90"/>
+            </w:tcMar>
+            <w:vAlign w:val="center"/>
+          </w:tcPr>
+          <w:p>
+            <w:pPr>
+              <w:spacing w:after="0"/>
+            </w:pPr>
+          </w:p>
+        </w:tc>
+      </w:tr>
+    </w:tbl>
+    <w:p>
+      <w:pPr>
+        <w:spacing w:after="80"/>
+      </w:pPr>
+    </w:p>
+    <w:p>
+      <w:pPr>
+        <w:keepNext/>
+        <w:spacing w:after="100" w:before="200"/>
+      </w:pPr>
+      <w:r>
+        <w:rPr>
+          <w:rFonts w:ascii="Calibri" w:cs="Calibri" w:eastAsia="Calibri" w:hAnsi="Calibri"/>
+          <w:b/>
+          <w:bCs/>
+          <w:color w:val="1A9E9E"/>
+          <w:sz w:val="22"/>
+          <w:szCs w:val="22"/>
+        </w:rPr>
+        <w:t xml:space="preserve">AXP-33. Formats de fichiers refusés dans la data room</w:t>
+      </w:r>
+    </w:p>
+    <w:p>
+      <w:pPr>
+        <w:spacing w:after="100"/>
+        <w:jc w:val="both"/>
+      </w:pPr>
+      <w:r>
+        <w:rPr>
+          <w:rFonts w:ascii="Calibri" w:cs="Calibri" w:eastAsia="Calibri" w:hAnsi="Calibri"/>
+          <w:sz w:val="20"/>
+          <w:szCs w:val="20"/>
+        </w:rPr>
+        <w:t xml:space="preserve">Objectif : vérifier que seuls les formats sûrs entrent dans la data room.</w:t>
+      </w:r>
+    </w:p>
+    <w:p>
+      <w:pPr>
+        <w:spacing w:after="100"/>
+        <w:jc w:val="both"/>
+      </w:pPr>
+      <w:r>
+        <w:rPr>
+          <w:rFonts w:ascii="Calibri" w:cs="Calibri" w:eastAsia="Calibri" w:hAnsi="Calibri"/>
+          <w:sz w:val="20"/>
+          <w:szCs w:val="20"/>
+        </w:rPr>
+        <w:t xml:space="preserve">Compte : test.consultant.</w:t>
+      </w:r>
+    </w:p>
+    <w:p>
+      <w:pPr>
+        <w:spacing w:after="100"/>
+        <w:jc w:val="both"/>
+      </w:pPr>
+      <w:r>
+        <w:rPr>
+          <w:rFonts w:ascii="Calibri" w:cs="Calibri" w:eastAsia="Calibri" w:hAnsi="Calibri"/>
+          <w:sz w:val="20"/>
+          <w:szCs w:val="20"/>
+        </w:rPr>
+        <w:t xml:space="preserve">Données : une archive .zip ; un ancien document Word .doc ; un document Word à macros (.docm).</w:t>
+      </w:r>
+    </w:p>
+    <w:p>
+      <w:pPr>
+        <w:tabs>
+          <w:tab w:val="left" w:pos="360"/>
+        </w:tabs>
+        <w:spacing w:after="60"/>
+        <w:ind w:left="360" w:hanging="360"/>
+        <w:jc w:val="both"/>
+      </w:pPr>
+      <w:r>
+        <w:rPr>
+          <w:rFonts w:ascii="Calibri" w:cs="Calibri" w:eastAsia="Calibri" w:hAnsi="Calibri"/>
+          <w:b/>
+          <w:bCs/>
+          <w:color w:val="1A9E9E"/>
+          <w:sz w:val="20"/>
+          <w:szCs w:val="20"/>
+        </w:rPr>
+        <w:t xml:space="preserve">1.	</w:t>
+      </w:r>
+      <w:r>
+        <w:rPr>
+          <w:rFonts w:ascii="Calibri" w:cs="Calibri" w:eastAsia="Calibri" w:hAnsi="Calibri"/>
+          <w:sz w:val="20"/>
+          <w:szCs w:val="20"/>
+        </w:rPr>
+        <w:t xml:space="preserve">Onglet « Data room », « Pièce libre » : choisissez l'archive (affichez « Tous les fichiers » dans la fenêtre de choix).</w:t>
+      </w:r>
+    </w:p>
+    <w:p>
+      <w:pPr>
+        <w:tabs>
+          <w:tab w:val="left" w:pos="360"/>
+        </w:tabs>
+        <w:spacing w:after="60"/>
+        <w:ind w:left="360" w:hanging="360"/>
+        <w:jc w:val="both"/>
+      </w:pPr>
+      <w:r>
+        <w:rPr>
+          <w:rFonts w:ascii="Calibri" w:cs="Calibri" w:eastAsia="Calibri" w:hAnsi="Calibri"/>
+          <w:b/>
+          <w:bCs/>
+          <w:color w:val="1A9E9E"/>
+          <w:sz w:val="20"/>
+          <w:szCs w:val="20"/>
+        </w:rPr>
+        <w:t xml:space="preserve">2.	</w:t>
+      </w:r>
+      <w:r>
+        <w:rPr>
+          <w:rFonts w:ascii="Calibri" w:cs="Calibri" w:eastAsia="Calibri" w:hAnsi="Calibri"/>
+          <w:sz w:val="20"/>
+          <w:szCs w:val="20"/>
+        </w:rPr>
+        <w:t xml:space="preserve">Recommencez avec le .doc, puis le .docm.</w:t>
+      </w:r>
+    </w:p>
+    <w:p>
+      <w:pPr>
+        <w:spacing w:after="100"/>
+        <w:jc w:val="both"/>
+      </w:pPr>
+      <w:r>
+        <w:rPr>
+          <w:rFonts w:ascii="Calibri" w:cs="Calibri" w:eastAsia="Calibri" w:hAnsi="Calibri"/>
+          <w:sz w:val="20"/>
+          <w:szCs w:val="20"/>
+        </w:rPr>
+        <w:t xml:space="preserve">Résultat attendu : chaque dépôt est refusé par un message qui rappelle les formats acceptés : PDF, JPEG, PNG, Word (.docx) ou Excel (.xlsx). Aucune pièce n'est ajoutée.</w:t>
+      </w:r>
+    </w:p>
+    <w:tbl>
+      <w:tblPr>
+        <w:tblW w:type="dxa" w:w="9638"/>
+        <w:tblBorders>
+          <w:top w:val="single" w:color="auto" w:sz="4"/>
+          <w:left w:val="single" w:color="auto" w:sz="4"/>
+          <w:bottom w:val="single" w:color="auto" w:sz="4"/>
+          <w:right w:val="single" w:color="auto" w:sz="4"/>
+          <w:insideH w:val="single" w:color="auto" w:sz="4"/>
+          <w:insideV w:val="single" w:color="auto" w:sz="4"/>
+        </w:tblBorders>
+      </w:tblPr>
+      <w:tblGrid>
+        <w:gridCol w:w="2586"/>
+        <w:gridCol w:w="7052"/>
+      </w:tblGrid>
+      <w:tr>
+        <w:trPr>
+          <w:tblHeader/>
+        </w:trPr>
+        <w:tc>
+          <w:tcPr>
+            <w:tcW w:type="dxa" w:w="2586"/>
+            <w:tcBorders>
+              <w:top w:val="single" w:color="C9CFD8" w:sz="4"/>
+              <w:left w:val="single" w:color="C9CFD8" w:sz="4"/>
+              <w:bottom w:val="single" w:color="C9CFD8" w:sz="4"/>
+              <w:right w:val="single" w:color="C9CFD8" w:sz="4"/>
+            </w:tcBorders>
+            <w:shd w:fill="1C1E6B" w:color="auto" w:val="clear"/>
+            <w:tcMar>
+              <w:top w:type="dxa" w:w="50"/>
+              <w:left w:type="dxa" w:w="90"/>
+              <w:bottom w:type="dxa" w:w="50"/>
+              <w:right w:type="dxa" w:w="90"/>
+            </w:tcMar>
+            <w:vAlign w:val="center"/>
+          </w:tcPr>
+          <w:p>
+            <w:pPr>
+              <w:spacing w:after="0"/>
+            </w:pPr>
+            <w:r>
+              <w:rPr>
+                <w:rFonts w:ascii="Calibri" w:cs="Calibri" w:eastAsia="Calibri" w:hAnsi="Calibri"/>
+                <w:b/>
+                <w:bCs/>
+                <w:color w:val="FFFFFF"/>
+                <w:sz w:val="17"/>
+                <w:szCs w:val="17"/>
+              </w:rPr>
+              <w:t xml:space="preserve">Résultat</w:t>
+            </w:r>
+          </w:p>
+        </w:tc>
+        <w:tc>
+          <w:tcPr>
+            <w:tcW w:type="dxa" w:w="7052"/>
+            <w:tcBorders>
+              <w:top w:val="single" w:color="C9CFD8" w:sz="4"/>
+              <w:left w:val="single" w:color="C9CFD8" w:sz="4"/>
+              <w:bottom w:val="single" w:color="C9CFD8" w:sz="4"/>
+              <w:right w:val="single" w:color="C9CFD8" w:sz="4"/>
+            </w:tcBorders>
+            <w:shd w:fill="1C1E6B" w:color="auto" w:val="clear"/>
+            <w:tcMar>
+              <w:top w:type="dxa" w:w="50"/>
+              <w:left w:type="dxa" w:w="90"/>
+              <w:bottom w:type="dxa" w:w="50"/>
+              <w:right w:type="dxa" w:w="90"/>
+            </w:tcMar>
+            <w:vAlign w:val="center"/>
+          </w:tcPr>
+          <w:p>
+            <w:pPr>
+              <w:spacing w:after="0"/>
+            </w:pPr>
+            <w:r>
+              <w:rPr>
+                <w:rFonts w:ascii="Calibri" w:cs="Calibri" w:eastAsia="Calibri" w:hAnsi="Calibri"/>
+                <w:b/>
+                <w:bCs/>
+                <w:color w:val="FFFFFF"/>
+                <w:sz w:val="17"/>
+                <w:szCs w:val="17"/>
+              </w:rPr>
+              <w:t xml:space="preserve">Remarques</w:t>
+            </w:r>
+          </w:p>
+        </w:tc>
+      </w:tr>
+      <w:tr>
+        <w:tc>
+          <w:tcPr>
+            <w:tcW w:type="dxa" w:w="2586"/>
+            <w:tcBorders>
+              <w:top w:val="single" w:color="C9CFD8" w:sz="4"/>
+              <w:left w:val="single" w:color="C9CFD8" w:sz="4"/>
+              <w:bottom w:val="single" w:color="C9CFD8" w:sz="4"/>
+              <w:right w:val="single" w:color="C9CFD8" w:sz="4"/>
+            </w:tcBorders>
+            <w:tcMar>
+              <w:top w:type="dxa" w:w="50"/>
+              <w:left w:type="dxa" w:w="90"/>
+              <w:bottom w:type="dxa" w:w="50"/>
+              <w:right w:type="dxa" w:w="90"/>
+            </w:tcMar>
+            <w:vAlign w:val="center"/>
+          </w:tcPr>
+          <w:p>
+            <w:pPr>
+              <w:spacing w:after="0"/>
+            </w:pPr>
+            <w:r>
+              <w:rPr>
+                <w:rFonts w:ascii="Calibri" w:cs="Calibri" w:eastAsia="Calibri" w:hAnsi="Calibri"/>
+                <w:sz w:val="17"/>
+                <w:szCs w:val="17"/>
+              </w:rPr>
+              <w:t xml:space="preserve">☐ Réussi</w:t>
+            </w:r>
+          </w:p>
+        </w:tc>
+        <w:tc>
+          <w:tcPr>
+            <w:tcW w:type="dxa" w:w="7052"/>
+            <w:tcBorders>
+              <w:top w:val="single" w:color="C9CFD8" w:sz="4"/>
+              <w:left w:val="single" w:color="C9CFD8" w:sz="4"/>
+              <w:bottom w:val="single" w:color="C9CFD8" w:sz="4"/>
+              <w:right w:val="single" w:color="C9CFD8" w:sz="4"/>
+            </w:tcBorders>
+            <w:tcMar>
+              <w:top w:type="dxa" w:w="50"/>
+              <w:left w:type="dxa" w:w="90"/>
+              <w:bottom w:type="dxa" w:w="50"/>
+              <w:right w:type="dxa" w:w="90"/>
+            </w:tcMar>
+            <w:vAlign w:val="center"/>
+          </w:tcPr>
+          <w:p>
+            <w:pPr>
+              <w:spacing w:after="0"/>
+            </w:pPr>
+          </w:p>
+        </w:tc>
+      </w:tr>
+      <w:tr>
+        <w:tc>
+          <w:tcPr>
+            <w:tcW w:type="dxa" w:w="2586"/>
+            <w:tcBorders>
+              <w:top w:val="single" w:color="C9CFD8" w:sz="4"/>
+              <w:left w:val="single" w:color="C9CFD8" w:sz="4"/>
+              <w:bottom w:val="single" w:color="C9CFD8" w:sz="4"/>
+              <w:right w:val="single" w:color="C9CFD8" w:sz="4"/>
+            </w:tcBorders>
+            <w:shd w:fill="F2F4F7" w:color="auto" w:val="clear"/>
+            <w:tcMar>
+              <w:top w:type="dxa" w:w="50"/>
+              <w:left w:type="dxa" w:w="90"/>
+              <w:bottom w:type="dxa" w:w="50"/>
+              <w:right w:type="dxa" w:w="90"/>
+            </w:tcMar>
+            <w:vAlign w:val="center"/>
+          </w:tcPr>
+          <w:p>
+            <w:pPr>
+              <w:spacing w:after="0"/>
+            </w:pPr>
+            <w:r>
+              <w:rPr>
+                <w:rFonts w:ascii="Calibri" w:cs="Calibri" w:eastAsia="Calibri" w:hAnsi="Calibri"/>
+                <w:sz w:val="17"/>
+                <w:szCs w:val="17"/>
+              </w:rPr>
+              <w:t xml:space="preserve">☐ Échoué</w:t>
+            </w:r>
+          </w:p>
+        </w:tc>
+        <w:tc>
+          <w:tcPr>
+            <w:tcW w:type="dxa" w:w="7052"/>
+            <w:tcBorders>
+              <w:top w:val="single" w:color="C9CFD8" w:sz="4"/>
+              <w:left w:val="single" w:color="C9CFD8" w:sz="4"/>
+              <w:bottom w:val="single" w:color="C9CFD8" w:sz="4"/>
+              <w:right w:val="single" w:color="C9CFD8" w:sz="4"/>
+            </w:tcBorders>
+            <w:shd w:fill="F2F4F7" w:color="auto" w:val="clear"/>
+            <w:tcMar>
+              <w:top w:type="dxa" w:w="50"/>
+              <w:left w:type="dxa" w:w="90"/>
+              <w:bottom w:type="dxa" w:w="50"/>
+              <w:right w:type="dxa" w:w="90"/>
+            </w:tcMar>
+            <w:vAlign w:val="center"/>
+          </w:tcPr>
+          <w:p>
+            <w:pPr>
+              <w:spacing w:after="0"/>
+            </w:pPr>
+          </w:p>
+        </w:tc>
+      </w:tr>
+    </w:tbl>
+    <w:p>
+      <w:pPr>
+        <w:spacing w:after="80"/>
+      </w:pPr>
+    </w:p>
+    <w:p>
+      <w:pPr>
+        <w:keepNext/>
+        <w:pBdr>
+          <w:bottom w:val="single" w:color="1A9E9E" w:sz="6" w:space="2"/>
+        </w:pBdr>
+        <w:spacing w:after="100" w:before="280"/>
+      </w:pPr>
+      <w:r>
+        <w:rPr>
+          <w:rFonts w:ascii="Calibri" w:cs="Calibri" w:eastAsia="Calibri" w:hAnsi="Calibri"/>
+          <w:b/>
+          <w:bCs/>
+          <w:color w:val="1C1E6B"/>
+          <w:sz w:val="26"/>
+          <w:szCs w:val="26"/>
+        </w:rPr>
+        <w:t xml:space="preserve">F. Contrôles de saisie et de sécurité</w:t>
+      </w:r>
+    </w:p>
+    <w:p>
+      <w:pPr>
+        <w:keepNext/>
+        <w:spacing w:after="100" w:before="200"/>
+      </w:pPr>
+      <w:r>
+        <w:rPr>
+          <w:rFonts w:ascii="Calibri" w:cs="Calibri" w:eastAsia="Calibri" w:hAnsi="Calibri"/>
+          <w:b/>
+          <w:bCs/>
+          <w:color w:val="1A9E9E"/>
+          <w:sz w:val="22"/>
+          <w:szCs w:val="22"/>
+        </w:rPr>
+        <w:t xml:space="preserve">AXP-34. Nombres écrits à la française</w:t>
+      </w:r>
+    </w:p>
+    <w:p>
+      <w:pPr>
+        <w:spacing w:after="100"/>
+        <w:jc w:val="both"/>
+      </w:pPr>
+      <w:r>
+        <w:rPr>
+          <w:rFonts w:ascii="Calibri" w:cs="Calibri" w:eastAsia="Calibri" w:hAnsi="Calibri"/>
+          <w:sz w:val="20"/>
+          <w:szCs w:val="20"/>
+        </w:rPr>
+        <w:t xml:space="preserve">Objectif : vérifier que les montants et les heures s'écrivent à la française et qu'une écriture ambiguë est refusée avec un message, sans être mal lue.</w:t>
+      </w:r>
+    </w:p>
+    <w:p>
+      <w:pPr>
+        <w:spacing w:after="100"/>
+        <w:jc w:val="both"/>
+      </w:pPr>
+      <w:r>
+        <w:rPr>
+          <w:rFonts w:ascii="Calibri" w:cs="Calibri" w:eastAsia="Calibri" w:hAnsi="Calibri"/>
+          <w:sz w:val="20"/>
+          <w:szCs w:val="20"/>
+        </w:rPr>
+        <w:t xml:space="preserve">Compte : test.consultant.</w:t>
+      </w:r>
+    </w:p>
+    <w:p>
+      <w:pPr>
+        <w:spacing w:after="100"/>
+        <w:jc w:val="both"/>
+      </w:pPr>
+      <w:r>
+        <w:rPr>
+          <w:rFonts w:ascii="Calibri" w:cs="Calibri" w:eastAsia="Calibri" w:hAnsi="Calibri"/>
+          <w:sz w:val="20"/>
+          <w:szCs w:val="20"/>
+        </w:rPr>
+        <w:t xml:space="preserve">Données : modèle financier : prix « 12 500 » puis « 12.500 » puis « 2.500.000 » ; temps : « 1,5 » heure.</w:t>
+      </w:r>
+    </w:p>
+    <w:p>
+      <w:pPr>
+        <w:tabs>
+          <w:tab w:val="left" w:pos="360"/>
+        </w:tabs>
+        <w:spacing w:after="60"/>
+        <w:ind w:left="360" w:hanging="360"/>
+        <w:jc w:val="both"/>
+      </w:pPr>
+      <w:r>
+        <w:rPr>
+          <w:rFonts w:ascii="Calibri" w:cs="Calibri" w:eastAsia="Calibri" w:hAnsi="Calibri"/>
+          <w:b/>
+          <w:bCs/>
+          <w:color w:val="1A9E9E"/>
+          <w:sz w:val="20"/>
+          <w:szCs w:val="20"/>
+        </w:rPr>
+        <w:t xml:space="preserve">1.	</w:t>
+      </w:r>
+      <w:r>
+        <w:rPr>
+          <w:rFonts w:ascii="Calibri" w:cs="Calibri" w:eastAsia="Calibri" w:hAnsi="Calibri"/>
+          <w:sz w:val="20"/>
+          <w:szCs w:val="20"/>
+        </w:rPr>
+        <w:t xml:space="preserve">Modèle financier, case « Prix unitaire » d'un produit : saisissez « 12 500 », cliquez ailleurs.</w:t>
+      </w:r>
+    </w:p>
+    <w:p>
+      <w:pPr>
+        <w:tabs>
+          <w:tab w:val="left" w:pos="360"/>
+        </w:tabs>
+        <w:spacing w:after="60"/>
+        <w:ind w:left="360" w:hanging="360"/>
+        <w:jc w:val="both"/>
+      </w:pPr>
+      <w:r>
+        <w:rPr>
+          <w:rFonts w:ascii="Calibri" w:cs="Calibri" w:eastAsia="Calibri" w:hAnsi="Calibri"/>
+          <w:b/>
+          <w:bCs/>
+          <w:color w:val="1A9E9E"/>
+          <w:sz w:val="20"/>
+          <w:szCs w:val="20"/>
+        </w:rPr>
+        <w:t xml:space="preserve">2.	</w:t>
+      </w:r>
+      <w:r>
+        <w:rPr>
+          <w:rFonts w:ascii="Calibri" w:cs="Calibri" w:eastAsia="Calibri" w:hAnsi="Calibri"/>
+          <w:sz w:val="20"/>
+          <w:szCs w:val="20"/>
+        </w:rPr>
+        <w:t xml:space="preserve">Saisissez « 12.500 », cliquez ailleurs.</w:t>
+      </w:r>
+    </w:p>
+    <w:p>
+      <w:pPr>
+        <w:tabs>
+          <w:tab w:val="left" w:pos="360"/>
+        </w:tabs>
+        <w:spacing w:after="60"/>
+        <w:ind w:left="360" w:hanging="360"/>
+        <w:jc w:val="both"/>
+      </w:pPr>
+      <w:r>
+        <w:rPr>
+          <w:rFonts w:ascii="Calibri" w:cs="Calibri" w:eastAsia="Calibri" w:hAnsi="Calibri"/>
+          <w:b/>
+          <w:bCs/>
+          <w:color w:val="1A9E9E"/>
+          <w:sz w:val="20"/>
+          <w:szCs w:val="20"/>
+        </w:rPr>
+        <w:t xml:space="preserve">3.	</w:t>
+      </w:r>
+      <w:r>
+        <w:rPr>
+          <w:rFonts w:ascii="Calibri" w:cs="Calibri" w:eastAsia="Calibri" w:hAnsi="Calibri"/>
+          <w:sz w:val="20"/>
+          <w:szCs w:val="20"/>
+        </w:rPr>
+        <w:t xml:space="preserve">Saisissez « 2.500.000 », cliquez ailleurs, puis appuyez sur Échap.</w:t>
+      </w:r>
+    </w:p>
+    <w:p>
+      <w:pPr>
+        <w:tabs>
+          <w:tab w:val="left" w:pos="360"/>
+        </w:tabs>
+        <w:spacing w:after="60"/>
+        <w:ind w:left="360" w:hanging="360"/>
+        <w:jc w:val="both"/>
+      </w:pPr>
+      <w:r>
+        <w:rPr>
+          <w:rFonts w:ascii="Calibri" w:cs="Calibri" w:eastAsia="Calibri" w:hAnsi="Calibri"/>
+          <w:b/>
+          <w:bCs/>
+          <w:color w:val="1A9E9E"/>
+          <w:sz w:val="20"/>
+          <w:szCs w:val="20"/>
+        </w:rPr>
+        <w:t xml:space="preserve">4.	</w:t>
+      </w:r>
+      <w:r>
+        <w:rPr>
+          <w:rFonts w:ascii="Calibri" w:cs="Calibri" w:eastAsia="Calibri" w:hAnsi="Calibri"/>
+          <w:sz w:val="20"/>
+          <w:szCs w:val="20"/>
+        </w:rPr>
+        <w:t xml:space="preserve">Onglet « Temps », « Saisir du temps » : « Heures » « 1,5 », enregistrez.</w:t>
+      </w:r>
+    </w:p>
+    <w:p>
+      <w:pPr>
+        <w:spacing w:after="100"/>
+        <w:jc w:val="both"/>
+      </w:pPr>
+      <w:r>
+        <w:rPr>
+          <w:rFonts w:ascii="Calibri" w:cs="Calibri" w:eastAsia="Calibri" w:hAnsi="Calibri"/>
+          <w:sz w:val="20"/>
+          <w:szCs w:val="20"/>
+        </w:rPr>
+        <w:t xml:space="preserve">Résultat attendu : « 12 500 » est enregistré tel quel. « 12.500 » et « 2.500.000 » sont refusés par le message « Nombre illisible : écrivez par exemple 750 000 ou 2,5. » sous la case : rien n'est enregistré, la valeur n'est jamais lue 12,5 ; Échap reprend la valeur enregistrée. « 1,5 » heure est accepté.</w:t>
+      </w:r>
+    </w:p>
+    <w:tbl>
+      <w:tblPr>
+        <w:tblW w:type="dxa" w:w="9638"/>
+        <w:tblBorders>
+          <w:top w:val="single" w:color="auto" w:sz="4"/>
+          <w:left w:val="single" w:color="auto" w:sz="4"/>
+          <w:bottom w:val="single" w:color="auto" w:sz="4"/>
+          <w:right w:val="single" w:color="auto" w:sz="4"/>
+          <w:insideH w:val="single" w:color="auto" w:sz="4"/>
+          <w:insideV w:val="single" w:color="auto" w:sz="4"/>
+        </w:tblBorders>
+      </w:tblPr>
+      <w:tblGrid>
+        <w:gridCol w:w="2586"/>
+        <w:gridCol w:w="7052"/>
+      </w:tblGrid>
+      <w:tr>
+        <w:trPr>
+          <w:tblHeader/>
+        </w:trPr>
+        <w:tc>
+          <w:tcPr>
+            <w:tcW w:type="dxa" w:w="2586"/>
+            <w:tcBorders>
+              <w:top w:val="single" w:color="C9CFD8" w:sz="4"/>
+              <w:left w:val="single" w:color="C9CFD8" w:sz="4"/>
+              <w:bottom w:val="single" w:color="C9CFD8" w:sz="4"/>
+              <w:right w:val="single" w:color="C9CFD8" w:sz="4"/>
+            </w:tcBorders>
+            <w:shd w:fill="1C1E6B" w:color="auto" w:val="clear"/>
+            <w:tcMar>
+              <w:top w:type="dxa" w:w="50"/>
+              <w:left w:type="dxa" w:w="90"/>
+              <w:bottom w:type="dxa" w:w="50"/>
+              <w:right w:type="dxa" w:w="90"/>
+            </w:tcMar>
+            <w:vAlign w:val="center"/>
+          </w:tcPr>
+          <w:p>
+            <w:pPr>
+              <w:spacing w:after="0"/>
+            </w:pPr>
+            <w:r>
+              <w:rPr>
+                <w:rFonts w:ascii="Calibri" w:cs="Calibri" w:eastAsia="Calibri" w:hAnsi="Calibri"/>
+                <w:b/>
+                <w:bCs/>
+                <w:color w:val="FFFFFF"/>
+                <w:sz w:val="17"/>
+                <w:szCs w:val="17"/>
+              </w:rPr>
+              <w:t xml:space="preserve">Résultat</w:t>
+            </w:r>
+          </w:p>
+        </w:tc>
+        <w:tc>
+          <w:tcPr>
+            <w:tcW w:type="dxa" w:w="7052"/>
+            <w:tcBorders>
+              <w:top w:val="single" w:color="C9CFD8" w:sz="4"/>
+              <w:left w:val="single" w:color="C9CFD8" w:sz="4"/>
+              <w:bottom w:val="single" w:color="C9CFD8" w:sz="4"/>
+              <w:right w:val="single" w:color="C9CFD8" w:sz="4"/>
+            </w:tcBorders>
+            <w:shd w:fill="1C1E6B" w:color="auto" w:val="clear"/>
+            <w:tcMar>
+              <w:top w:type="dxa" w:w="50"/>
+              <w:left w:type="dxa" w:w="90"/>
+              <w:bottom w:type="dxa" w:w="50"/>
+              <w:right w:type="dxa" w:w="90"/>
+            </w:tcMar>
+            <w:vAlign w:val="center"/>
+          </w:tcPr>
+          <w:p>
+            <w:pPr>
+              <w:spacing w:after="0"/>
+            </w:pPr>
+            <w:r>
+              <w:rPr>
+                <w:rFonts w:ascii="Calibri" w:cs="Calibri" w:eastAsia="Calibri" w:hAnsi="Calibri"/>
+                <w:b/>
+                <w:bCs/>
+                <w:color w:val="FFFFFF"/>
+                <w:sz w:val="17"/>
+                <w:szCs w:val="17"/>
+              </w:rPr>
+              <w:t xml:space="preserve">Remarques</w:t>
+            </w:r>
+          </w:p>
+        </w:tc>
+      </w:tr>
+      <w:tr>
+        <w:tc>
+          <w:tcPr>
+            <w:tcW w:type="dxa" w:w="2586"/>
+            <w:tcBorders>
+              <w:top w:val="single" w:color="C9CFD8" w:sz="4"/>
+              <w:left w:val="single" w:color="C9CFD8" w:sz="4"/>
+              <w:bottom w:val="single" w:color="C9CFD8" w:sz="4"/>
+              <w:right w:val="single" w:color="C9CFD8" w:sz="4"/>
+            </w:tcBorders>
+            <w:tcMar>
+              <w:top w:type="dxa" w:w="50"/>
+              <w:left w:type="dxa" w:w="90"/>
+              <w:bottom w:type="dxa" w:w="50"/>
+              <w:right w:type="dxa" w:w="90"/>
+            </w:tcMar>
+            <w:vAlign w:val="center"/>
+          </w:tcPr>
+          <w:p>
+            <w:pPr>
+              <w:spacing w:after="0"/>
+            </w:pPr>
+            <w:r>
+              <w:rPr>
+                <w:rFonts w:ascii="Calibri" w:cs="Calibri" w:eastAsia="Calibri" w:hAnsi="Calibri"/>
+                <w:sz w:val="17"/>
+                <w:szCs w:val="17"/>
+              </w:rPr>
+              <w:t xml:space="preserve">☐ Réussi</w:t>
+            </w:r>
+          </w:p>
+        </w:tc>
+        <w:tc>
+          <w:tcPr>
+            <w:tcW w:type="dxa" w:w="7052"/>
+            <w:tcBorders>
+              <w:top w:val="single" w:color="C9CFD8" w:sz="4"/>
+              <w:left w:val="single" w:color="C9CFD8" w:sz="4"/>
+              <w:bottom w:val="single" w:color="C9CFD8" w:sz="4"/>
+              <w:right w:val="single" w:color="C9CFD8" w:sz="4"/>
+            </w:tcBorders>
+            <w:tcMar>
+              <w:top w:type="dxa" w:w="50"/>
+              <w:left w:type="dxa" w:w="90"/>
+              <w:bottom w:type="dxa" w:w="50"/>
+              <w:right w:type="dxa" w:w="90"/>
+            </w:tcMar>
+            <w:vAlign w:val="center"/>
+          </w:tcPr>
+          <w:p>
+            <w:pPr>
+              <w:spacing w:after="0"/>
+            </w:pPr>
+          </w:p>
+        </w:tc>
+      </w:tr>
+      <w:tr>
+        <w:tc>
+          <w:tcPr>
+            <w:tcW w:type="dxa" w:w="2586"/>
+            <w:tcBorders>
+              <w:top w:val="single" w:color="C9CFD8" w:sz="4"/>
+              <w:left w:val="single" w:color="C9CFD8" w:sz="4"/>
+              <w:bottom w:val="single" w:color="C9CFD8" w:sz="4"/>
+              <w:right w:val="single" w:color="C9CFD8" w:sz="4"/>
+            </w:tcBorders>
+            <w:shd w:fill="F2F4F7" w:color="auto" w:val="clear"/>
+            <w:tcMar>
+              <w:top w:type="dxa" w:w="50"/>
+              <w:left w:type="dxa" w:w="90"/>
+              <w:bottom w:type="dxa" w:w="50"/>
+              <w:right w:type="dxa" w:w="90"/>
+            </w:tcMar>
+            <w:vAlign w:val="center"/>
+          </w:tcPr>
+          <w:p>
+            <w:pPr>
+              <w:spacing w:after="0"/>
+            </w:pPr>
+            <w:r>
+              <w:rPr>
+                <w:rFonts w:ascii="Calibri" w:cs="Calibri" w:eastAsia="Calibri" w:hAnsi="Calibri"/>
+                <w:sz w:val="17"/>
+                <w:szCs w:val="17"/>
+              </w:rPr>
+              <w:t xml:space="preserve">☐ Échoué</w:t>
+            </w:r>
+          </w:p>
+        </w:tc>
+        <w:tc>
+          <w:tcPr>
+            <w:tcW w:type="dxa" w:w="7052"/>
+            <w:tcBorders>
+              <w:top w:val="single" w:color="C9CFD8" w:sz="4"/>
+              <w:left w:val="single" w:color="C9CFD8" w:sz="4"/>
+              <w:bottom w:val="single" w:color="C9CFD8" w:sz="4"/>
+              <w:right w:val="single" w:color="C9CFD8" w:sz="4"/>
+            </w:tcBorders>
+            <w:shd w:fill="F2F4F7" w:color="auto" w:val="clear"/>
+            <w:tcMar>
+              <w:top w:type="dxa" w:w="50"/>
+              <w:left w:type="dxa" w:w="90"/>
+              <w:bottom w:type="dxa" w:w="50"/>
+              <w:right w:type="dxa" w:w="90"/>
+            </w:tcMar>
+            <w:vAlign w:val="center"/>
+          </w:tcPr>
+          <w:p>
+            <w:pPr>
+              <w:spacing w:after="0"/>
+            </w:pPr>
+          </w:p>
+        </w:tc>
+      </w:tr>
+    </w:tbl>
+    <w:p>
+      <w:pPr>
+        <w:spacing w:after="80"/>
+      </w:pPr>
+    </w:p>
+    <w:p>
+      <w:pPr>
+        <w:keepNext/>
+        <w:spacing w:after="100" w:before="200"/>
+      </w:pPr>
+      <w:r>
+        <w:rPr>
+          <w:rFonts w:ascii="Calibri" w:cs="Calibri" w:eastAsia="Calibri" w:hAnsi="Calibri"/>
+          <w:b/>
+          <w:bCs/>
+          <w:color w:val="1A9E9E"/>
+          <w:sz w:val="22"/>
+          <w:szCs w:val="22"/>
+        </w:rPr>
+        <w:t xml:space="preserve">AXP-35. Un double clic ne franchit qu'un gate et ne crée qu'une facture</w:t>
+      </w:r>
+    </w:p>
+    <w:p>
+      <w:pPr>
+        <w:spacing w:after="100"/>
+        <w:jc w:val="both"/>
+      </w:pPr>
+      <w:r>
+        <w:rPr>
+          <w:rFonts w:ascii="Calibri" w:cs="Calibri" w:eastAsia="Calibri" w:hAnsi="Calibri"/>
+          <w:sz w:val="20"/>
+          <w:szCs w:val="20"/>
+        </w:rPr>
+        <w:t xml:space="preserve">Objectif : vérifier qu'un double clic n'enregistre qu'une fois.</w:t>
+      </w:r>
+    </w:p>
+    <w:p>
+      <w:pPr>
+        <w:spacing w:after="100"/>
+        <w:jc w:val="both"/>
+      </w:pPr>
+      <w:r>
+        <w:rPr>
+          <w:rFonts w:ascii="Calibri" w:cs="Calibri" w:eastAsia="Calibri" w:hAnsi="Calibri"/>
+          <w:sz w:val="20"/>
+          <w:szCs w:val="20"/>
+        </w:rPr>
+        <w:t xml:space="preserve">Compte : test.consultant.</w:t>
+      </w:r>
+    </w:p>
+    <w:p>
+      <w:pPr>
+        <w:spacing w:after="100"/>
+        <w:jc w:val="both"/>
+      </w:pPr>
+      <w:r>
+        <w:rPr>
+          <w:rFonts w:ascii="Calibri" w:cs="Calibri" w:eastAsia="Calibri" w:hAnsi="Calibri"/>
+          <w:sz w:val="20"/>
+          <w:szCs w:val="20"/>
+        </w:rPr>
+        <w:t xml:space="preserve">Données : un dossier dont le gate en cours permet le passage ; des temps à facturer.</w:t>
+      </w:r>
+    </w:p>
+    <w:p>
+      <w:pPr>
+        <w:tabs>
+          <w:tab w:val="left" w:pos="360"/>
+        </w:tabs>
+        <w:spacing w:after="60"/>
+        <w:ind w:left="360" w:hanging="360"/>
+        <w:jc w:val="both"/>
+      </w:pPr>
+      <w:r>
+        <w:rPr>
+          <w:rFonts w:ascii="Calibri" w:cs="Calibri" w:eastAsia="Calibri" w:hAnsi="Calibri"/>
+          <w:b/>
+          <w:bCs/>
+          <w:color w:val="1A9E9E"/>
+          <w:sz w:val="20"/>
+          <w:szCs w:val="20"/>
+        </w:rPr>
+        <w:t xml:space="preserve">1.	</w:t>
+      </w:r>
+      <w:r>
+        <w:rPr>
+          <w:rFonts w:ascii="Calibri" w:cs="Calibri" w:eastAsia="Calibri" w:hAnsi="Calibri"/>
+          <w:sz w:val="20"/>
+          <w:szCs w:val="20"/>
+        </w:rPr>
+        <w:t xml:space="preserve">Onglet « Stage gates » : double-cliquez sur « Passer au gate suivant ».</w:t>
+      </w:r>
+    </w:p>
+    <w:p>
+      <w:pPr>
+        <w:tabs>
+          <w:tab w:val="left" w:pos="360"/>
+        </w:tabs>
+        <w:spacing w:after="60"/>
+        <w:ind w:left="360" w:hanging="360"/>
+        <w:jc w:val="both"/>
+      </w:pPr>
+      <w:r>
+        <w:rPr>
+          <w:rFonts w:ascii="Calibri" w:cs="Calibri" w:eastAsia="Calibri" w:hAnsi="Calibri"/>
+          <w:b/>
+          <w:bCs/>
+          <w:color w:val="1A9E9E"/>
+          <w:sz w:val="20"/>
+          <w:szCs w:val="20"/>
+        </w:rPr>
+        <w:t xml:space="preserve">2.	</w:t>
+      </w:r>
+      <w:r>
+        <w:rPr>
+          <w:rFonts w:ascii="Calibri" w:cs="Calibri" w:eastAsia="Calibri" w:hAnsi="Calibri"/>
+          <w:sz w:val="20"/>
+          <w:szCs w:val="20"/>
+        </w:rPr>
+        <w:t xml:space="preserve">Onglet « Temps » : double-cliquez sur « Créer la facture ».</w:t>
+      </w:r>
+    </w:p>
+    <w:p>
+      <w:pPr>
+        <w:spacing w:after="100"/>
+        <w:jc w:val="both"/>
+      </w:pPr>
+      <w:r>
+        <w:rPr>
+          <w:rFonts w:ascii="Calibri" w:cs="Calibri" w:eastAsia="Calibri" w:hAnsi="Calibri"/>
+          <w:sz w:val="20"/>
+          <w:szCs w:val="20"/>
+        </w:rPr>
+        <w:t xml:space="preserve">Résultat attendu : le dossier ne franchit qu'un seul gate ; si le second clic arrive, l'écran le dit et relit le dossier. Une seule facture d'honoraires est créée.</w:t>
+      </w:r>
+    </w:p>
+    <w:tbl>
+      <w:tblPr>
+        <w:tblW w:type="dxa" w:w="9638"/>
+        <w:tblBorders>
+          <w:top w:val="single" w:color="auto" w:sz="4"/>
+          <w:left w:val="single" w:color="auto" w:sz="4"/>
+          <w:bottom w:val="single" w:color="auto" w:sz="4"/>
+          <w:right w:val="single" w:color="auto" w:sz="4"/>
+          <w:insideH w:val="single" w:color="auto" w:sz="4"/>
+          <w:insideV w:val="single" w:color="auto" w:sz="4"/>
+        </w:tblBorders>
+      </w:tblPr>
+      <w:tblGrid>
+        <w:gridCol w:w="2586"/>
+        <w:gridCol w:w="7052"/>
+      </w:tblGrid>
+      <w:tr>
+        <w:trPr>
+          <w:tblHeader/>
+        </w:trPr>
+        <w:tc>
+          <w:tcPr>
+            <w:tcW w:type="dxa" w:w="2586"/>
+            <w:tcBorders>
+              <w:top w:val="single" w:color="C9CFD8" w:sz="4"/>
+              <w:left w:val="single" w:color="C9CFD8" w:sz="4"/>
+              <w:bottom w:val="single" w:color="C9CFD8" w:sz="4"/>
+              <w:right w:val="single" w:color="C9CFD8" w:sz="4"/>
+            </w:tcBorders>
+            <w:shd w:fill="1C1E6B" w:color="auto" w:val="clear"/>
+            <w:tcMar>
+              <w:top w:type="dxa" w:w="50"/>
+              <w:left w:type="dxa" w:w="90"/>
+              <w:bottom w:type="dxa" w:w="50"/>
+              <w:right w:type="dxa" w:w="90"/>
+            </w:tcMar>
+            <w:vAlign w:val="center"/>
+          </w:tcPr>
+          <w:p>
+            <w:pPr>
+              <w:spacing w:after="0"/>
+            </w:pPr>
+            <w:r>
+              <w:rPr>
+                <w:rFonts w:ascii="Calibri" w:cs="Calibri" w:eastAsia="Calibri" w:hAnsi="Calibri"/>
+                <w:b/>
+                <w:bCs/>
+                <w:color w:val="FFFFFF"/>
+                <w:sz w:val="17"/>
+                <w:szCs w:val="17"/>
+              </w:rPr>
+              <w:t xml:space="preserve">Résultat</w:t>
+            </w:r>
+          </w:p>
+        </w:tc>
+        <w:tc>
+          <w:tcPr>
+            <w:tcW w:type="dxa" w:w="7052"/>
+            <w:tcBorders>
+              <w:top w:val="single" w:color="C9CFD8" w:sz="4"/>
+              <w:left w:val="single" w:color="C9CFD8" w:sz="4"/>
+              <w:bottom w:val="single" w:color="C9CFD8" w:sz="4"/>
+              <w:right w:val="single" w:color="C9CFD8" w:sz="4"/>
+            </w:tcBorders>
+            <w:shd w:fill="1C1E6B" w:color="auto" w:val="clear"/>
+            <w:tcMar>
+              <w:top w:type="dxa" w:w="50"/>
+              <w:left w:type="dxa" w:w="90"/>
+              <w:bottom w:type="dxa" w:w="50"/>
+              <w:right w:type="dxa" w:w="90"/>
+            </w:tcMar>
+            <w:vAlign w:val="center"/>
+          </w:tcPr>
+          <w:p>
+            <w:pPr>
+              <w:spacing w:after="0"/>
+            </w:pPr>
+            <w:r>
+              <w:rPr>
+                <w:rFonts w:ascii="Calibri" w:cs="Calibri" w:eastAsia="Calibri" w:hAnsi="Calibri"/>
+                <w:b/>
+                <w:bCs/>
+                <w:color w:val="FFFFFF"/>
+                <w:sz w:val="17"/>
+                <w:szCs w:val="17"/>
+              </w:rPr>
+              <w:t xml:space="preserve">Remarques</w:t>
+            </w:r>
+          </w:p>
+        </w:tc>
+      </w:tr>
+      <w:tr>
+        <w:tc>
+          <w:tcPr>
+            <w:tcW w:type="dxa" w:w="2586"/>
+            <w:tcBorders>
+              <w:top w:val="single" w:color="C9CFD8" w:sz="4"/>
+              <w:left w:val="single" w:color="C9CFD8" w:sz="4"/>
+              <w:bottom w:val="single" w:color="C9CFD8" w:sz="4"/>
+              <w:right w:val="single" w:color="C9CFD8" w:sz="4"/>
+            </w:tcBorders>
+            <w:tcMar>
+              <w:top w:type="dxa" w:w="50"/>
+              <w:left w:type="dxa" w:w="90"/>
+              <w:bottom w:type="dxa" w:w="50"/>
+              <w:right w:type="dxa" w:w="90"/>
+            </w:tcMar>
+            <w:vAlign w:val="center"/>
+          </w:tcPr>
+          <w:p>
+            <w:pPr>
+              <w:spacing w:after="0"/>
+            </w:pPr>
+            <w:r>
+              <w:rPr>
+                <w:rFonts w:ascii="Calibri" w:cs="Calibri" w:eastAsia="Calibri" w:hAnsi="Calibri"/>
+                <w:sz w:val="17"/>
+                <w:szCs w:val="17"/>
+              </w:rPr>
+              <w:t xml:space="preserve">☐ Réussi</w:t>
+            </w:r>
+          </w:p>
+        </w:tc>
+        <w:tc>
+          <w:tcPr>
+            <w:tcW w:type="dxa" w:w="7052"/>
+            <w:tcBorders>
+              <w:top w:val="single" w:color="C9CFD8" w:sz="4"/>
+              <w:left w:val="single" w:color="C9CFD8" w:sz="4"/>
+              <w:bottom w:val="single" w:color="C9CFD8" w:sz="4"/>
+              <w:right w:val="single" w:color="C9CFD8" w:sz="4"/>
+            </w:tcBorders>
+            <w:tcMar>
+              <w:top w:type="dxa" w:w="50"/>
+              <w:left w:type="dxa" w:w="90"/>
+              <w:bottom w:type="dxa" w:w="50"/>
+              <w:right w:type="dxa" w:w="90"/>
+            </w:tcMar>
+            <w:vAlign w:val="center"/>
+          </w:tcPr>
+          <w:p>
+            <w:pPr>
+              <w:spacing w:after="0"/>
+            </w:pPr>
+          </w:p>
+        </w:tc>
+      </w:tr>
+      <w:tr>
+        <w:tc>
+          <w:tcPr>
+            <w:tcW w:type="dxa" w:w="2586"/>
+            <w:tcBorders>
+              <w:top w:val="single" w:color="C9CFD8" w:sz="4"/>
+              <w:left w:val="single" w:color="C9CFD8" w:sz="4"/>
+              <w:bottom w:val="single" w:color="C9CFD8" w:sz="4"/>
+              <w:right w:val="single" w:color="C9CFD8" w:sz="4"/>
+            </w:tcBorders>
+            <w:shd w:fill="F2F4F7" w:color="auto" w:val="clear"/>
+            <w:tcMar>
+              <w:top w:type="dxa" w:w="50"/>
+              <w:left w:type="dxa" w:w="90"/>
+              <w:bottom w:type="dxa" w:w="50"/>
+              <w:right w:type="dxa" w:w="90"/>
+            </w:tcMar>
+            <w:vAlign w:val="center"/>
+          </w:tcPr>
+          <w:p>
+            <w:pPr>
+              <w:spacing w:after="0"/>
+            </w:pPr>
+            <w:r>
+              <w:rPr>
+                <w:rFonts w:ascii="Calibri" w:cs="Calibri" w:eastAsia="Calibri" w:hAnsi="Calibri"/>
+                <w:sz w:val="17"/>
+                <w:szCs w:val="17"/>
+              </w:rPr>
+              <w:t xml:space="preserve">☐ Échoué</w:t>
+            </w:r>
+          </w:p>
+        </w:tc>
+        <w:tc>
+          <w:tcPr>
+            <w:tcW w:type="dxa" w:w="7052"/>
+            <w:tcBorders>
+              <w:top w:val="single" w:color="C9CFD8" w:sz="4"/>
+              <w:left w:val="single" w:color="C9CFD8" w:sz="4"/>
+              <w:bottom w:val="single" w:color="C9CFD8" w:sz="4"/>
+              <w:right w:val="single" w:color="C9CFD8" w:sz="4"/>
+            </w:tcBorders>
+            <w:shd w:fill="F2F4F7" w:color="auto" w:val="clear"/>
+            <w:tcMar>
+              <w:top w:type="dxa" w:w="50"/>
+              <w:left w:type="dxa" w:w="90"/>
+              <w:bottom w:type="dxa" w:w="50"/>
+              <w:right w:type="dxa" w:w="90"/>
+            </w:tcMar>
+            <w:vAlign w:val="center"/>
+          </w:tcPr>
+          <w:p>
+            <w:pPr>
+              <w:spacing w:after="0"/>
+            </w:pPr>
+          </w:p>
+        </w:tc>
+      </w:tr>
+    </w:tbl>
+    <w:p>
+      <w:pPr>
+        <w:spacing w:after="80"/>
+      </w:pPr>
+    </w:p>
+    <w:p>
+      <w:pPr>
+        <w:keepNext/>
+        <w:spacing w:after="100" w:before="200"/>
+      </w:pPr>
+      <w:r>
+        <w:rPr>
+          <w:rFonts w:ascii="Calibri" w:cs="Calibri" w:eastAsia="Calibri" w:hAnsi="Calibri"/>
+          <w:b/>
+          <w:bCs/>
+          <w:color w:val="1A9E9E"/>
+          <w:sz w:val="22"/>
+          <w:szCs w:val="22"/>
+        </w:rPr>
+        <w:t xml:space="preserve">AXP-36. Confirmation avant une action irréversible</w:t>
       </w:r>
     </w:p>
     <w:p>
@@ -13988,7 +15820,7 @@
                 <w:sz w:val="17"/>
                 <w:szCs w:val="17"/>
               </w:rPr>
-              <w:t xml:space="preserve">15</w:t>
+              <w:t xml:space="preserve">17</w:t>
             </w:r>
           </w:p>
         </w:tc>
@@ -14091,7 +15923,7 @@
                 <w:sz w:val="17"/>
                 <w:szCs w:val="17"/>
               </w:rPr>
-              <w:t xml:space="preserve">B. Associé : second regard et décision du comité</w:t>
+              <w:t xml:space="preserve">B. Associé : second regard et décisions à deux</w:t>
             </w:r>
           </w:p>
         </w:tc>
@@ -14123,7 +15955,7 @@
                 <w:sz w:val="17"/>
                 <w:szCs w:val="17"/>
               </w:rPr>
-              <w:t xml:space="preserve">4</w:t>
+              <w:t xml:space="preserve">6</w:t>
             </w:r>
           </w:p>
         </w:tc>
@@ -14801,7 +16633,7 @@
                 <w:sz w:val="17"/>
                 <w:szCs w:val="17"/>
               </w:rPr>
-              <w:t xml:space="preserve">32</w:t>
+              <w:t xml:space="preserve">36</w:t>
             </w:r>
           </w:p>
         </w:tc>

</xml_diff>